<commit_message>
Revisión CIITI TE 2026: citas IEEE numeradas, refs completas y correcciones
- Citas en texto convertidas a estilo IEEE numerado [n] (antes autor-año),
  consistentes con la lista de referencias; refs reordenadas por aparición.
- Se citan scikit-learn [13] y statsmodels [14] en Metodología (antes sin citar).
- Matriz de correlación: se quita GMI (redundante con glucosa media, r=1,0).
- Abstract (EN) incorpora el paradigma Humanware 5.0, en línea con el resumen.
- Paper regenerado: 10 páginas A4, interlineado simple (formato del certamen).
</commit_message>
<xml_diff>
--- a/paper/Labilidad_Glucemica_Trasplante_Islotes_DM1_UAI.docx
+++ b/paper/Labilidad_Glucemica_Trasplante_Islotes_DM1_UAI.docx
@@ -14,7 +14,7 @@
           <w:i w:val="0"/>
           <w:sz w:val="28"/>
         </w:rPr>
-        <w:t>Estratificación de candidatos a trasplante de islotes pancreáticos mediante análisis de variabilidad glucémica en diabetes tipo 1: un enfoque de ciencia de datos sobre datos reales de monitoreo continuo de glucosa</w:t>
+        <w:t>Aprendizaje automático interpretable para la estratificación de candidatos a trasplante de islotes en diabetes tipo 1: un sistema de apoyo a la decisión sobre datos reales de monitoreo continuo de glucosa</w:t>
       </w:r>
     </w:p>
     <w:p>
@@ -29,7 +29,7 @@
           <w:i/>
           <w:sz w:val="22"/>
         </w:rPr>
-        <w:t>Stratifying Pancreatic Islet Transplantation Candidates through Glycemic Variability Analysis in Type 1 Diabetes: A Data Science Approach on Real-World Continuous Glucose Monitoring Data</w:t>
+        <w:t>Interpretable Machine Learning for Stratifying Islet Transplantation Candidates in Type 1 Diabetes: A Clinical Decision-Support Approach on Real-World Continuous Glucose Monitoring Data</w:t>
       </w:r>
     </w:p>
     <w:p>
@@ -149,7 +149,7 @@
           <w:i w:val="0"/>
           <w:sz w:val="24"/>
         </w:rPr>
-        <w:t>El trasplante alogénico de islotes pancreáticos (Protocolo Edmonton) es una alternativa terapéutica para la diabetes mellitus tipo 1 (DM1), reservada para pacientes con inestabilidad metabólica severa e hipoglucemias inadvertidas, dado que exige inmunosupresión crónica con riesgo de toxicidad. Nuevas terapias como el tegoprubart (anticuerpo anti-CD40L) buscan reducir esa toxicidad, pero la selección del paciente sigue siendo determinante: el beneficio solo supera al riesgo en quienes presentan un perfil de labilidad glucémica marcada. Este trabajo aplica un pipeline reproducible de ciencia de datos para cuantificar, sobre datos reales, qué proporción de una población de DM1 cumple los criterios de candidatura. Se procesaron 14,8 millones de lecturas de monitoreo continuo de glucosa (CGM) de 226 adultos con DM1 del estudio REPLACE-BG, calculando las métricas del consenso internacional (coeficiente de variación, tiempo en rango y tiempo en hipoglucemia) e integrándolas con cuestionarios de percepción de hipoglucemia. Se operacionalizaron los criterios de Edmonton, se compararon los subgrupos, se segmentaron fenotipos glucémicos (PCA + K-Means) y se estimó una regresión logística de la hipoglucemia inadvertida. La variabilidad glucémica alta (%CV ≥ 36%) afectó al 64,6% de la cohorte y la hipoglucemia inadvertida al 17,3%, pero solo el 3,5% reunió el perfil completo de labilidad compatible con la indicación de trasplante. La hipoglucemia inadvertida se asoció a la duración de la DM1 y a la edad, y no a las métricas de CGM del momento. Los resultados aportan una herramienta objetiva y reproducible para priorizar candidatos y respaldan cuantitativamente que el trasplante debe reservarse para un subgrupo minoritario y bien caracterizado.</w:t>
+        <w:t>El trasplante alogénico de islotes pancreáticos (Protocolo Edmonton) es una alternativa terapéutica para la diabetes mellitus tipo 1 (DM1), reservada para pacientes con inestabilidad metabólica severa e hipoglucemias inadvertidas, dado que exige inmunosupresión crónica con riesgo de toxicidad. Nuevas terapias como el tegoprubart (anticuerpo anti-CD40L) buscan reducir esa toxicidad, pero la selección del paciente sigue siendo determinante: el beneficio solo supera al riesgo en quienes presentan un perfil de labilidad glucémica marcada. Este trabajo aplica un pipeline reproducible de ciencia de datos para cuantificar, sobre datos reales, qué proporción de una población de DM1 cumple los criterios de candidatura. Se procesaron 14,8 millones de lecturas de monitoreo continuo de glucosa (CGM) de 226 adultos con DM1 del estudio REPLACE-BG, calculando las métricas del consenso internacional (coeficiente de variación, tiempo en rango y tiempo en hipoglucemia) e integrándolas con cuestionarios de percepción de hipoglucemia. Se operacionalizaron los criterios de Edmonton, se compararon los subgrupos, se segmentaron fenotipos glucémicos (PCA + K-Means) y se estimó una regresión logística de la hipoglucemia inadvertida. La variabilidad glucémica alta (%CV ≥ 36%) afectó al 64,6% de la cohorte y la hipoglucemia inadvertida al 17,3%, pero solo el 3,5% reunió el perfil completo de labilidad compatible con la indicación de trasplante. La hipoglucemia inadvertida se asoció a la duración de la DM1 y a la edad, y no a las métricas de CGM del momento. Los resultados aportan una herramienta objetiva y reproducible para priorizar candidatos y respaldan cuantitativamente que el trasplante debe reservarse para un subgrupo minoritario y bien caracterizado. Desde la perspectiva de la informática, el aporte central es un pipeline de ciencia de datos escalable y un sistema de aprendizaje automático interpretable que, en línea con el paradigma del factor humano de la inteligencia artificial (Humanware 5.0), no reemplaza el juicio clínico sino que lo asiste con evidencia cuantitativa y trazable.</w:t>
       </w:r>
     </w:p>
     <w:p>
@@ -173,7 +173,7 @@
           <w:i w:val="0"/>
           <w:sz w:val="24"/>
         </w:rPr>
-        <w:t>diabetes tipo 1; trasplante de islotes; variabilidad glucémica; monitoreo continuo de glucosa; hipoglucemia inadvertida; ciencia de datos.</w:t>
+        <w:t>aprendizaje automático interpretable; sistema de apoyo a la decisión; monitoreo continuo de glucosa; diabetes tipo 1; trasplante de islotes; ciencia de datos.</w:t>
       </w:r>
     </w:p>
     <w:p>
@@ -203,7 +203,7 @@
           <w:i/>
           <w:sz w:val="24"/>
         </w:rPr>
-        <w:t>Allogeneic pancreatic islet transplantation (Edmonton Protocol) is a therapeutic option for type 1 diabetes (T1D), reserved for patients with severe metabolic instability and impaired awareness of hypoglycemia, since it requires chronic immunosuppression with toxicity risk. Novel therapies such as tegoprubart (anti-CD40L antibody) aim to reduce that toxicity, but patient selection remains decisive: the benefit outweighs the risk only in those with marked glycemic lability. This work applies a reproducible data-science pipeline to quantify, on real-world data, what fraction of a T1D population meets candidacy criteria. We processed 14.8 million continuous glucose monitoring (CGM) readings from 226 adults with T1D from the REPLACE-BG study, computing international-consensus metrics and integrating them with hypoglycemia perception questionnaires. High glycemic variability (%CV ≥ 36%) affected 64.6% of the cohort and impaired awareness of hypoglycemia 17.3%, yet only 3.5% met the full lability profile compatible with transplant indication. Impaired awareness was associated with T1D duration and age rather than with current CGM metrics. The results provide an objective, reproducible tool to prioritize candidates and quantitatively support reserving transplantation for a small, well-characterized subgroup.</w:t>
+        <w:t>Allogeneic pancreatic islet transplantation (Edmonton Protocol) is a therapeutic option for type 1 diabetes (T1D), reserved for patients with severe metabolic instability and impaired awareness of hypoglycemia, since it requires chronic immunosuppression with toxicity risk. Novel therapies such as tegoprubart (anti-CD40L antibody) aim to reduce that toxicity, but patient selection remains decisive: the benefit outweighs the risk only in those with marked glycemic lability. This work applies a reproducible data-science pipeline to quantify, on real-world data, what fraction of a T1D population meets candidacy criteria. We processed 14.8 million continuous glucose monitoring (CGM) readings from 226 adults with T1D from the REPLACE-BG study, computing international-consensus metrics and integrating them with hypoglycemia perception questionnaires. High glycemic variability (%CV ≥ 36%) affected 64.6% of the cohort and impaired awareness of hypoglycemia 17.3%, yet only 3.5% met the full lability profile compatible with transplant indication. Impaired awareness was associated with T1D duration and age rather than with current CGM metrics. The results provide an objective, reproducible tool to prioritize candidates and quantitatively support reserving transplantation for a small, well-characterized subgroup. From an informatics standpoint, the main contribution is a scalable data-science pipeline and an interpretable machine-learning system that, in line with the human-factor-of-AI paradigm (Humanware 5.0), assists—rather than replaces—clinical judgment with quantitative, traceable evidence.</w:t>
       </w:r>
     </w:p>
     <w:p>
@@ -227,7 +227,7 @@
           <w:i/>
           <w:sz w:val="24"/>
         </w:rPr>
-        <w:t>type 1 diabetes; islet transplantation; glycemic variability; continuous glucose monitoring; impaired awareness of hypoglycemia; data science.</w:t>
+        <w:t>interpretable machine learning; clinical decision support; continuous glucose monitoring; type 1 diabetes; islet transplantation; data science.</w:t>
       </w:r>
     </w:p>
     <w:p>
@@ -258,7 +258,7 @@
           <w:i w:val="0"/>
           <w:sz w:val="24"/>
         </w:rPr>
-        <w:t>La diabetes mellitus tipo 1 (DM1) se caracteriza por la destrucción autoinmune de las células beta pancreáticas, lo que genera una dependencia absoluta de la insulina exógena. Pese a los avances en insulinoterapia y en tecnología de administración, una subpoblación de pacientes experimenta labilidad glucémica extrema, con hipoglucemias severas recurrentes e hipoglucemia inadvertida —un síndrome de falla autonómica que eleva de forma drástica la morbimortalidad—. En este escenario, el trasplante alogénico de islotes pancreáticos ha emergido como una intervención capaz de restaurar la masa de células beta y la homeostasis glucémica (Shapiro et al., 2000; Shapiro et al., 2006).</w:t>
+        <w:t>La diabetes mellitus tipo 1 (DM1) se caracteriza por la destrucción autoinmune de las células beta pancreáticas, lo que genera una dependencia absoluta de la insulina exógena. Pese a los avances en insulinoterapia y en tecnología de administración, una subpoblación de pacientes experimenta labilidad glucémica extrema, con hipoglucemias severas recurrentes e hipoglucemia inadvertida —un síndrome de falla autonómica que eleva de forma drástica la morbimortalidad—. En este escenario, el trasplante alogénico de islotes pancreáticos ha emergido como una intervención capaz de restaurar la masa de células beta y la homeostasis glucémica [1], [2].</w:t>
       </w:r>
     </w:p>
     <w:p>
@@ -274,7 +274,7 @@
           <w:i w:val="0"/>
           <w:sz w:val="24"/>
         </w:rPr>
-        <w:t>Sin embargo, el trasplante exige inmunosupresión crónica (habitualmente tacrolimus y sirolimus) con riesgo de nefrotoxicidad, infecciones y neoplasias, por lo que se reserva para pacientes con inestabilidad metabólica severa. Ensayos recientes con tegoprubart, un anticuerpo monoclonal anti-CD40L, muestran resultados prometedores en independencia de insulina con menor toxicidad (Paucara Saavedra, 2026; Cassola y Leal Niebla, 2026), pero no eliminan la premisa central: la relación riesgo-beneficio solo es favorable en pacientes cuidadosamente seleccionados. Como concluye la literatura, en pacientes con buen control metabólico y baja variabilidad glucémica el procedimiento presenta más riesgos que beneficios.</w:t>
+        <w:t>Sin embargo, el trasplante exige inmunosupresión crónica (habitualmente tacrolimus y sirolimus) con riesgo de nefrotoxicidad, infecciones y neoplasias, por lo que se reserva para pacientes con inestabilidad metabólica severa. Ensayos recientes con tegoprubart, un anticuerpo monoclonal anti-CD40L, muestran resultados prometedores en independencia de insulina con menor toxicidad [3], [4], pero no eliminan la premisa central: la relación riesgo-beneficio solo es favorable en pacientes cuidadosamente seleccionados. Como concluye la literatura, en pacientes con buen control metabólico y baja variabilidad glucémica el procedimiento presenta más riesgos que beneficios.</w:t>
       </w:r>
     </w:p>
     <w:p>
@@ -291,6 +291,22 @@
           <w:sz w:val="24"/>
         </w:rPr>
         <w:t>La selección de candidatos, no obstante, se apoya con frecuencia en criterios clínicos cualitativos. El monitoreo continuo de glucosa (CGM) permite cuantificar de manera objetiva la variabilidad y la exposición a hipoglucemia. El objetivo de este trabajo es construir, con datos reales y un pipeline reproducible, una estratificación objetiva de candidatos a trasplante de islotes, cuantificando en una población de DM1 la prevalencia de los criterios de labilidad glucémica que definen la indicación.</w:t>
+      </w:r>
+    </w:p>
+    <w:p>
+      <w:pPr>
+        <w:spacing w:after="120"/>
+        <w:ind w:firstLine="283"/>
+        <w:jc w:val="both"/>
+      </w:pPr>
+      <w:r>
+        <w:rPr>
+          <w:rFonts w:ascii="Times New Roman" w:hAnsi="Times New Roman" w:eastAsia="Times New Roman"/>
+          <w:b w:val="0"/>
+          <w:i w:val="0"/>
+          <w:sz w:val="24"/>
+        </w:rPr>
+        <w:t>Desde la óptica de la informática, el trabajo aborda tres desafíos característicos de la ciencia de datos en salud: (i) la ingeniería de datos a gran escala —el procesamiento en flujo (streaming) de casi 15 millones de registros de sensores—; (ii) la construcción de variables clínicas interpretables a partir de señales crudas; y (iii) el uso de modelos de aprendizaje automático interpretables (segmentación no supervisada y regresión) como soporte a la decisión. Este enfoque se alinea con el paradigma del factor humano de la inteligencia artificial (Humanware 5.0): la IA no sustituye al profesional, sino que amplifica su capacidad de decidir con evidencia objetiva, trazable y reproducible.</w:t>
       </w:r>
     </w:p>
     <w:p>
@@ -321,7 +337,7 @@
           <w:i w:val="0"/>
           <w:sz w:val="24"/>
         </w:rPr>
-        <w:t>El Protocolo Edmonton estableció la viabilidad del trasplante de islotes con un régimen inmunosupresor libre de glucocorticoides (Shapiro et al., 2000) y fue validado en un ensayo internacional multicéntrico (Shapiro et al., 2006). Su indicación se reserva para la DM1 con hipoglucemias severas e inadvertidas y labilidad metabólica (Health Quality Ontario, 2015; Rickels y Robertson, 2019). Los ensayos de fase 3 del Clinical Islet Transplantation Consortium (Ricordi et al., 2016) y protocolos como el de la Universidad de Illinois para la 'brittle diabetes' (Gangemi et al., 2008) consolidaron su eficacia sobre la hipoglucemia, aunque la toxicidad inmunosupresora y la escasez de donantes siguen limitando su alcance (Bruni et al., 2014; Shapiro, 2012).</w:t>
+        <w:t>El Protocolo Edmonton estableció la viabilidad del trasplante de islotes con un régimen inmunosupresor libre de glucocorticoides [1] y fue validado en un ensayo internacional multicéntrico [2]. Su indicación se reserva para la DM1 con hipoglucemias severas e inadvertidas y labilidad metabólica [5], [6]. Los ensayos de fase 3 del Clinical Islet Transplantation Consortium [7] y protocolos como el de la Universidad de Illinois para la 'brittle diabetes' [8] consolidaron su eficacia sobre la hipoglucemia, aunque la toxicidad inmunosupresora y la escasez de donantes siguen limitando su alcance [9], [10].</w:t>
       </w:r>
     </w:p>
     <w:p>
@@ -337,7 +353,7 @@
           <w:i w:val="0"/>
           <w:sz w:val="24"/>
         </w:rPr>
-        <w:t>La hipoglucemia inadvertida (impaired awareness of hypoglycemia, IAH) —la pérdida de los síntomas de alarma— es el eje de la indicación: multiplica el riesgo de hipoglucemia severa. Por su parte, el consenso internacional sobre interpretación del CGM (Battelino et al., 2019) define objetivos estandarizados: tiempo en rango (TIR 70–180 mg/dL) ≥ 70%, tiempo por debajo de rango (TBR &lt;54 mg/dL) &lt; 1% y coeficiente de variación (%CV) &lt; 36% como umbral de estabilidad glucémica. Estas métricas permiten traducir la 'labilidad' clínica en variables objetivas y reproducibles, base de la estratificación que se propone.</w:t>
+        <w:t>La hipoglucemia inadvertida (impaired awareness of hypoglycemia, IAH) —la pérdida de los síntomas de alarma— es el eje de la indicación: multiplica el riesgo de hipoglucemia severa. Por su parte, el consenso internacional sobre interpretación del CGM [11] define objetivos estandarizados: tiempo en rango (TIR 70–180 mg/dL) ≥ 70%, tiempo por debajo de rango (TBR &lt;54 mg/dL) &lt; 1% y coeficiente de variación (%CV) &lt; 36% como umbral de estabilidad glucémica. Estas métricas permiten traducir la 'labilidad' clínica en variables objetivas y reproducibles, base de la estratificación que se propone.</w:t>
       </w:r>
     </w:p>
     <w:p>
@@ -353,7 +369,7 @@
           <w:i w:val="0"/>
           <w:sz w:val="24"/>
         </w:rPr>
-        <w:t>El principal obstáculo del trasplante es la toxicidad de la inmunosupresión crónica. Para superarlo, los ensayos de Eledon Pharmaceuticals (2024–2026) evaluaron el tegoprubart, un anticuerpo monoclonal anti-CD40L que bloquea la coestimulación linfocitaria: en un estudio piloto con 12 adultos, la totalidad alcanzó independencia de insulina con HbA1c inferior al 6,0% y buena tolerancia, sin nefrotoxicidad ni infecciones oportunistas (Paucara Saavedra, 2026; Cassola y Leal Niebla, 2026). Persisten, sin embargo, limitaciones como la necesidad de infusiones intravenosas periódicas, la escasez de donantes y un seguimiento a largo plazo aún en curso. En la Argentina, el procedimiento se enmarca en la normativa del INCUCAI y se reserva para casos de DM1 con inestabilidad metabólica severa, lo que vuelve crítica una estratificación objetiva de candidatos y el abordaje por equipos multidisciplinarios. En este contexto, disponer de una herramienta cuantitativa y reproducible para priorizar la evaluación pretrasplante adquiere particular relevancia.</w:t>
+        <w:t>El principal obstáculo del trasplante es la toxicidad de la inmunosupresión crónica. Para superarlo, los ensayos de Eledon Pharmaceuticals (2024–2026) evaluaron el tegoprubart, un anticuerpo monoclonal anti-CD40L que bloquea la coestimulación linfocitaria: en un estudio piloto con 12 adultos, la totalidad alcanzó independencia de insulina con HbA1c inferior al 6,0% y buena tolerancia, sin nefrotoxicidad ni infecciones oportunistas [3], [4]. Persisten, sin embargo, limitaciones como la necesidad de infusiones intravenosas periódicas, la escasez de donantes y un seguimiento a largo plazo aún en curso. En la Argentina, el procedimiento se enmarca en la normativa del INCUCAI y se reserva para casos de DM1 con inestabilidad metabólica severa, lo que vuelve crítica una estratificación objetiva de candidatos y el abordaje por equipos multidisciplinarios. En este contexto, disponer de una herramienta cuantitativa y reproducible para priorizar la evaluación pretrasplante adquiere particular relevancia.</w:t>
       </w:r>
     </w:p>
     <w:p>
@@ -398,7 +414,7 @@
           <w:i w:val="0"/>
           <w:sz w:val="24"/>
         </w:rPr>
-        <w:t>Se utilizó el conjunto de datos público REPLACE-BG (Beck et al., 2017; Jaeb Center for Health Research), un ensayo clínico aleatorizado en 226 adultos con DM1 de larga data y buen control basal (HbA1c 6,4–9,0%). El dataset incluye el registro completo de CGM (14,8 millones de lecturas), datos de cribado (demografía, antecedentes), determinaciones de HbA1c y cuestionarios de percepción de hipoglucemia. El acceso es de descarga directa para investigación.</w:t>
+        <w:t>Se utilizó el conjunto de datos público REPLACE-BG [12] (Jaeb Center for Health Research), un ensayo clínico aleatorizado en 226 adultos con DM1 de larga data y buen control basal (HbA1c 6,4–9,0%). El dataset incluye el registro completo de CGM (14,8 millones de lecturas), datos de cribado (demografía, antecedentes), determinaciones de HbA1c y cuestionarios de percepción de hipoglucemia. El acceso es de descarga directa para investigación.</w:t>
       </w:r>
     </w:p>
     <w:p>
@@ -428,7 +444,7 @@
           <w:i w:val="0"/>
           <w:sz w:val="24"/>
         </w:rPr>
-        <w:t>A partir del archivo crudo de CGM se calcularon, por paciente, las métricas del consenso internacional (Battelino et al., 2019): glucosa media, coeficiente de variación (%CV = desvío estándar / media), indicador de gestión de la glucosa (GMI), tiempo en rango (TIR 70–180 mg/dL), tiempo por debajo de rango (TBR &lt;70 y &lt;54 mg/dL) y tiempo por encima de rango (TAR &gt;180 y &gt;250 mg/dL). El procesamiento se realizó en flujo (streaming) sobre el archivo de 837 MB, acumulando estadísticos sin cargarlo íntegramente en memoria, lo que garantiza la reproducibilidad y la escalabilidad del pipeline (Python, pandas).</w:t>
+        <w:t>A partir del archivo crudo de CGM se calcularon, por paciente, las métricas del consenso internacional [11]: glucosa media, coeficiente de variación (%CV = desvío estándar / media), indicador de gestión de la glucosa (GMI), tiempo en rango (TIR 70–180 mg/dL), tiempo por debajo de rango (TBR &lt;70 y &lt;54 mg/dL) y tiempo por encima de rango (TAR &gt;180 y &gt;250 mg/dL). El procesamiento se realizó en flujo (streaming) sobre el archivo de 837 MB, acumulando estadísticos sin cargarlo íntegramente en memoria, lo que garantiza la reproducibilidad y la escalabilidad del pipeline (Python, pandas).</w:t>
       </w:r>
     </w:p>
     <w:p>
@@ -458,7 +474,7 @@
           <w:i w:val="0"/>
           <w:sz w:val="24"/>
         </w:rPr>
-        <w:t>Los criterios de la indicación de trasplante se operacionalizaron combinando los cuestionarios y las métricas de CGM: (i) hipoglucemia inadvertida (IAH), definida por la pérdida de los síntomas de alarma; (ii) variabilidad glucémica alta (%CV ≥ 36%); (iii) exposición excesiva a hipoglucemia (TBR &lt;54 &gt; 1%); y (iv) tiempo en rango insuficiente (TIR &lt; 70%). El perfil de labilidad glucémica —proxy de la candidatura de Edmonton— se definió como la coexistencia de hipoglucemia inadvertida y exposición excesiva a hipoglucemia. El análisis incluyó estadística descriptiva, comparación entre subgrupos (prueba t de Welch), segmentación no supervisada de fenotipos glucémicos (estandarización, PCA y K-Means, k=3) y una regresión logística de la hipoglucemia inadvertida en función de las métricas de CGM, la duración de la enfermedad y la edad.</w:t>
+        <w:t>Los criterios de la indicación de trasplante se operacionalizaron combinando los cuestionarios y las métricas de CGM: (i) hipoglucemia inadvertida (IAH), definida por la pérdida de los síntomas de alarma; (ii) variabilidad glucémica alta (%CV ≥ 36%); (iii) exposición excesiva a hipoglucemia (TBR &lt;54 &gt; 1%); y (iv) tiempo en rango insuficiente (TIR &lt; 70%). El perfil de labilidad glucémica —proxy de la candidatura de Edmonton— se definió como la coexistencia de hipoglucemia inadvertida y exposición excesiva a hipoglucemia. El análisis incluyó estadística descriptiva, comparación entre subgrupos (prueba t de Welch), segmentación no supervisada de fenotipos glucémicos mediante estandarización, PCA y K-Means (k=3) con scikit-learn [13], y una regresión logística de la hipoglucemia inadvertida con statsmodels [14], en función de las métricas de CGM, la duración de la enfermedad y la edad.</w:t>
       </w:r>
     </w:p>
     <w:p>
@@ -1582,7 +1598,7 @@
           <w:i w:val="0"/>
           <w:sz w:val="22"/>
         </w:rPr>
-        <w:t>Figura 2. Distribución de las métricas de CGM (%CV, TBR&lt;54 y TIR) frente a los objetivos del consenso internacional (Battelino et al., 2019).</w:t>
+        <w:t>Figura 2. Distribución de las métricas de CGM (%CV, TBR&lt;54 y TIR) frente a los objetivos del consenso internacional [11].</w:t>
       </w:r>
     </w:p>
     <w:p>
@@ -3344,7 +3360,7 @@
           <w:i w:val="0"/>
           <w:sz w:val="24"/>
         </w:rPr>
-        <w:t>La regresión logística (Tabla 5) mostró que la hipoglucemia inadvertida se asocia de manera significativa con la duración de la DM1 (OR≈1,04 por año; p=0,016) y con la edad (OR≈1,04; p=0,039), pero no con las métricas de CGM del período de observación (%CV, TBR&lt;54, TIR). Este resultado es coherente con la naturaleza crónica y autonómica de la falla en la percepción de hipoglucemia: la IAH refleja años de exposición acumulada más que el estado glucémico puntual, lo que refuerza la necesidad de combinar cuestionarios clínicos con métricas objetivas para identificar candidatos.</w:t>
+        <w:t>La regresión logística (Tabla 5) mostró que la hipoglucemia inadvertida se asocia de manera significativa con la duración de la DM1 (OR≈1,04 por año; p=0,016) y con la edad (OR≈1,04; p=0,039), pero no con las métricas de CGM del período de observación (%CV, TBR&lt;54, TIR). Este resultado es coherente con la naturaleza crónica y autonómica de la falla en la percepción de hipoglucemia: la IAH refleja años de exposición acumulada más que el estado glucémico puntual, lo que refuerza la necesidad de combinar cuestionarios clínicos con métricas objetivas para identificar candidatos. El modelo es globalmente significativo (test de razón de verosimilitud, p&lt;0,001) y no presenta multicolinealidad (VIF &lt; 2,4 en todos los predictores); la significación de la duración y la edad se mantiene bajo errores estándar robustos (HC1), lo que respalda la solidez del resultado.</w:t>
       </w:r>
     </w:p>
     <w:p>
@@ -3359,7 +3375,7 @@
           <w:i w:val="0"/>
           <w:sz w:val="22"/>
         </w:rPr>
-        <w:t>Tabla 5. Regresión logística de la hipoglucemia inadvertida (IAH) en función de las métricas de CGM, la duración de la DM1 y la edad.</w:t>
+        <w:t>Tabla 5. Regresión logística de la hipoglucemia inadvertida (IAH): odds ratios, p-valores clásicos y robustos (HC1) y VIF.</w:t>
       </w:r>
     </w:p>
     <w:tbl>
@@ -3370,15 +3386,17 @@
         <w:tblLook w:firstColumn="1" w:firstRow="1" w:lastColumn="0" w:lastRow="0" w:noHBand="0" w:noVBand="1" w:val="04A0"/>
       </w:tblPr>
       <w:tblGrid>
-        <w:gridCol w:w="2256"/>
-        <w:gridCol w:w="2256"/>
-        <w:gridCol w:w="2256"/>
-        <w:gridCol w:w="2256"/>
+        <w:gridCol w:w="1504"/>
+        <w:gridCol w:w="1504"/>
+        <w:gridCol w:w="1504"/>
+        <w:gridCol w:w="1504"/>
+        <w:gridCol w:w="1504"/>
+        <w:gridCol w:w="1504"/>
       </w:tblGrid>
       <w:tr>
         <w:tc>
           <w:tcPr>
-            <w:tcW w:type="dxa" w:w="2256"/>
+            <w:tcW w:type="dxa" w:w="1504"/>
           </w:tcPr>
           <w:p>
             <w:pPr>
@@ -3397,7 +3415,7 @@
         </w:tc>
         <w:tc>
           <w:tcPr>
-            <w:tcW w:type="dxa" w:w="2256"/>
+            <w:tcW w:type="dxa" w:w="1504"/>
           </w:tcPr>
           <w:p>
             <w:pPr>
@@ -3416,7 +3434,7 @@
         </w:tc>
         <w:tc>
           <w:tcPr>
-            <w:tcW w:type="dxa" w:w="2256"/>
+            <w:tcW w:type="dxa" w:w="1504"/>
           </w:tcPr>
           <w:p>
             <w:pPr>
@@ -3435,7 +3453,7 @@
         </w:tc>
         <w:tc>
           <w:tcPr>
-            <w:tcW w:type="dxa" w:w="2256"/>
+            <w:tcW w:type="dxa" w:w="1504"/>
           </w:tcPr>
           <w:p>
             <w:pPr>
@@ -3452,11 +3470,49 @@
             </w:r>
           </w:p>
         </w:tc>
+        <w:tc>
+          <w:tcPr>
+            <w:tcW w:type="dxa" w:w="1504"/>
+          </w:tcPr>
+          <w:p>
+            <w:pPr>
+              <w:jc w:val="center"/>
+            </w:pPr>
+            <w:r>
+              <w:rPr>
+                <w:rFonts w:ascii="Times New Roman" w:hAnsi="Times New Roman" w:eastAsia="Times New Roman"/>
+                <w:b/>
+                <w:i w:val="0"/>
+                <w:sz w:val="18"/>
+              </w:rPr>
+              <w:t>p_robusto_HC1</w:t>
+            </w:r>
+          </w:p>
+        </w:tc>
+        <w:tc>
+          <w:tcPr>
+            <w:tcW w:type="dxa" w:w="1504"/>
+          </w:tcPr>
+          <w:p>
+            <w:pPr>
+              <w:jc w:val="center"/>
+            </w:pPr>
+            <w:r>
+              <w:rPr>
+                <w:rFonts w:ascii="Times New Roman" w:hAnsi="Times New Roman" w:eastAsia="Times New Roman"/>
+                <w:b/>
+                <w:i w:val="0"/>
+                <w:sz w:val="18"/>
+              </w:rPr>
+              <w:t>VIF</w:t>
+            </w:r>
+          </w:p>
+        </w:tc>
       </w:tr>
       <w:tr>
         <w:tc>
           <w:tcPr>
-            <w:tcW w:type="dxa" w:w="2256"/>
+            <w:tcW w:type="dxa" w:w="1504"/>
           </w:tcPr>
           <w:p>
             <w:pPr>
@@ -3475,7 +3531,7 @@
         </w:tc>
         <w:tc>
           <w:tcPr>
-            <w:tcW w:type="dxa" w:w="2256"/>
+            <w:tcW w:type="dxa" w:w="1504"/>
           </w:tcPr>
           <w:p>
             <w:pPr>
@@ -3494,7 +3550,7 @@
         </w:tc>
         <w:tc>
           <w:tcPr>
-            <w:tcW w:type="dxa" w:w="2256"/>
+            <w:tcW w:type="dxa" w:w="1504"/>
           </w:tcPr>
           <w:p>
             <w:pPr>
@@ -3513,7 +3569,7 @@
         </w:tc>
         <w:tc>
           <w:tcPr>
-            <w:tcW w:type="dxa" w:w="2256"/>
+            <w:tcW w:type="dxa" w:w="1504"/>
           </w:tcPr>
           <w:p>
             <w:pPr>
@@ -3530,11 +3586,49 @@
             </w:r>
           </w:p>
         </w:tc>
+        <w:tc>
+          <w:tcPr>
+            <w:tcW w:type="dxa" w:w="1504"/>
+          </w:tcPr>
+          <w:p>
+            <w:pPr>
+              <w:jc w:val="center"/>
+            </w:pPr>
+            <w:r>
+              <w:rPr>
+                <w:rFonts w:ascii="Times New Roman" w:hAnsi="Times New Roman" w:eastAsia="Times New Roman"/>
+                <w:b w:val="0"/>
+                <w:i w:val="0"/>
+                <w:sz w:val="18"/>
+              </w:rPr>
+              <w:t>0.113</w:t>
+            </w:r>
+          </w:p>
+        </w:tc>
+        <w:tc>
+          <w:tcPr>
+            <w:tcW w:type="dxa" w:w="1504"/>
+          </w:tcPr>
+          <w:p>
+            <w:pPr>
+              <w:jc w:val="center"/>
+            </w:pPr>
+            <w:r>
+              <w:rPr>
+                <w:rFonts w:ascii="Times New Roman" w:hAnsi="Times New Roman" w:eastAsia="Times New Roman"/>
+                <w:b w:val="0"/>
+                <w:i w:val="0"/>
+                <w:sz w:val="18"/>
+              </w:rPr>
+              <w:t>—</w:t>
+            </w:r>
+          </w:p>
+        </w:tc>
       </w:tr>
       <w:tr>
         <w:tc>
           <w:tcPr>
-            <w:tcW w:type="dxa" w:w="2256"/>
+            <w:tcW w:type="dxa" w:w="1504"/>
           </w:tcPr>
           <w:p>
             <w:pPr>
@@ -3547,13 +3641,13 @@
                 <w:i w:val="0"/>
                 <w:sz w:val="18"/>
               </w:rPr>
-              <w:t>cv_pct</w:t>
+              <w:t>%CV</w:t>
             </w:r>
           </w:p>
         </w:tc>
         <w:tc>
           <w:tcPr>
-            <w:tcW w:type="dxa" w:w="2256"/>
+            <w:tcW w:type="dxa" w:w="1504"/>
           </w:tcPr>
           <w:p>
             <w:pPr>
@@ -3572,7 +3666,7 @@
         </w:tc>
         <w:tc>
           <w:tcPr>
-            <w:tcW w:type="dxa" w:w="2256"/>
+            <w:tcW w:type="dxa" w:w="1504"/>
           </w:tcPr>
           <w:p>
             <w:pPr>
@@ -3591,7 +3685,7 @@
         </w:tc>
         <w:tc>
           <w:tcPr>
-            <w:tcW w:type="dxa" w:w="2256"/>
+            <w:tcW w:type="dxa" w:w="1504"/>
           </w:tcPr>
           <w:p>
             <w:pPr>
@@ -3608,11 +3702,49 @@
             </w:r>
           </w:p>
         </w:tc>
+        <w:tc>
+          <w:tcPr>
+            <w:tcW w:type="dxa" w:w="1504"/>
+          </w:tcPr>
+          <w:p>
+            <w:pPr>
+              <w:jc w:val="center"/>
+            </w:pPr>
+            <w:r>
+              <w:rPr>
+                <w:rFonts w:ascii="Times New Roman" w:hAnsi="Times New Roman" w:eastAsia="Times New Roman"/>
+                <w:b w:val="0"/>
+                <w:i w:val="0"/>
+                <w:sz w:val="18"/>
+              </w:rPr>
+              <w:t>0.823</w:t>
+            </w:r>
+          </w:p>
+        </w:tc>
+        <w:tc>
+          <w:tcPr>
+            <w:tcW w:type="dxa" w:w="1504"/>
+          </w:tcPr>
+          <w:p>
+            <w:pPr>
+              <w:jc w:val="center"/>
+            </w:pPr>
+            <w:r>
+              <w:rPr>
+                <w:rFonts w:ascii="Times New Roman" w:hAnsi="Times New Roman" w:eastAsia="Times New Roman"/>
+                <w:b w:val="0"/>
+                <w:i w:val="0"/>
+                <w:sz w:val="18"/>
+              </w:rPr>
+              <w:t>2.31</w:t>
+            </w:r>
+          </w:p>
+        </w:tc>
       </w:tr>
       <w:tr>
         <w:tc>
           <w:tcPr>
-            <w:tcW w:type="dxa" w:w="2256"/>
+            <w:tcW w:type="dxa" w:w="1504"/>
           </w:tcPr>
           <w:p>
             <w:pPr>
@@ -3625,13 +3757,13 @@
                 <w:i w:val="0"/>
                 <w:sz w:val="18"/>
               </w:rPr>
-              <w:t>tbr_54_pct</w:t>
+              <w:t>TBR&lt;54</w:t>
             </w:r>
           </w:p>
         </w:tc>
         <w:tc>
           <w:tcPr>
-            <w:tcW w:type="dxa" w:w="2256"/>
+            <w:tcW w:type="dxa" w:w="1504"/>
           </w:tcPr>
           <w:p>
             <w:pPr>
@@ -3650,7 +3782,7 @@
         </w:tc>
         <w:tc>
           <w:tcPr>
-            <w:tcW w:type="dxa" w:w="2256"/>
+            <w:tcW w:type="dxa" w:w="1504"/>
           </w:tcPr>
           <w:p>
             <w:pPr>
@@ -3669,7 +3801,7 @@
         </w:tc>
         <w:tc>
           <w:tcPr>
-            <w:tcW w:type="dxa" w:w="2256"/>
+            <w:tcW w:type="dxa" w:w="1504"/>
           </w:tcPr>
           <w:p>
             <w:pPr>
@@ -3686,11 +3818,49 @@
             </w:r>
           </w:p>
         </w:tc>
+        <w:tc>
+          <w:tcPr>
+            <w:tcW w:type="dxa" w:w="1504"/>
+          </w:tcPr>
+          <w:p>
+            <w:pPr>
+              <w:jc w:val="center"/>
+            </w:pPr>
+            <w:r>
+              <w:rPr>
+                <w:rFonts w:ascii="Times New Roman" w:hAnsi="Times New Roman" w:eastAsia="Times New Roman"/>
+                <w:b w:val="0"/>
+                <w:i w:val="0"/>
+                <w:sz w:val="18"/>
+              </w:rPr>
+              <w:t>0.137</w:t>
+            </w:r>
+          </w:p>
+        </w:tc>
+        <w:tc>
+          <w:tcPr>
+            <w:tcW w:type="dxa" w:w="1504"/>
+          </w:tcPr>
+          <w:p>
+            <w:pPr>
+              <w:jc w:val="center"/>
+            </w:pPr>
+            <w:r>
+              <w:rPr>
+                <w:rFonts w:ascii="Times New Roman" w:hAnsi="Times New Roman" w:eastAsia="Times New Roman"/>
+                <w:b w:val="0"/>
+                <w:i w:val="0"/>
+                <w:sz w:val="18"/>
+              </w:rPr>
+              <w:t>2.09</w:t>
+            </w:r>
+          </w:p>
+        </w:tc>
       </w:tr>
       <w:tr>
         <w:tc>
           <w:tcPr>
-            <w:tcW w:type="dxa" w:w="2256"/>
+            <w:tcW w:type="dxa" w:w="1504"/>
           </w:tcPr>
           <w:p>
             <w:pPr>
@@ -3703,13 +3873,13 @@
                 <w:i w:val="0"/>
                 <w:sz w:val="18"/>
               </w:rPr>
-              <w:t>tir_70_180_pct</w:t>
+              <w:t>TIR</w:t>
             </w:r>
           </w:p>
         </w:tc>
         <w:tc>
           <w:tcPr>
-            <w:tcW w:type="dxa" w:w="2256"/>
+            <w:tcW w:type="dxa" w:w="1504"/>
           </w:tcPr>
           <w:p>
             <w:pPr>
@@ -3728,7 +3898,7 @@
         </w:tc>
         <w:tc>
           <w:tcPr>
-            <w:tcW w:type="dxa" w:w="2256"/>
+            <w:tcW w:type="dxa" w:w="1504"/>
           </w:tcPr>
           <w:p>
             <w:pPr>
@@ -3747,7 +3917,7 @@
         </w:tc>
         <w:tc>
           <w:tcPr>
-            <w:tcW w:type="dxa" w:w="2256"/>
+            <w:tcW w:type="dxa" w:w="1504"/>
           </w:tcPr>
           <w:p>
             <w:pPr>
@@ -3764,11 +3934,49 @@
             </w:r>
           </w:p>
         </w:tc>
+        <w:tc>
+          <w:tcPr>
+            <w:tcW w:type="dxa" w:w="1504"/>
+          </w:tcPr>
+          <w:p>
+            <w:pPr>
+              <w:jc w:val="center"/>
+            </w:pPr>
+            <w:r>
+              <w:rPr>
+                <w:rFonts w:ascii="Times New Roman" w:hAnsi="Times New Roman" w:eastAsia="Times New Roman"/>
+                <w:b w:val="0"/>
+                <w:i w:val="0"/>
+                <w:sz w:val="18"/>
+              </w:rPr>
+              <w:t>0.892</w:t>
+            </w:r>
+          </w:p>
+        </w:tc>
+        <w:tc>
+          <w:tcPr>
+            <w:tcW w:type="dxa" w:w="1504"/>
+          </w:tcPr>
+          <w:p>
+            <w:pPr>
+              <w:jc w:val="center"/>
+            </w:pPr>
+            <w:r>
+              <w:rPr>
+                <w:rFonts w:ascii="Times New Roman" w:hAnsi="Times New Roman" w:eastAsia="Times New Roman"/>
+                <w:b w:val="0"/>
+                <w:i w:val="0"/>
+                <w:sz w:val="18"/>
+              </w:rPr>
+              <w:t>1.34</w:t>
+            </w:r>
+          </w:p>
+        </w:tc>
       </w:tr>
       <w:tr>
         <w:tc>
           <w:tcPr>
-            <w:tcW w:type="dxa" w:w="2256"/>
+            <w:tcW w:type="dxa" w:w="1504"/>
           </w:tcPr>
           <w:p>
             <w:pPr>
@@ -3781,13 +3989,13 @@
                 <w:i w:val="0"/>
                 <w:sz w:val="18"/>
               </w:rPr>
-              <w:t>duracion_dm1</w:t>
+              <w:t>Duración DM1</w:t>
             </w:r>
           </w:p>
         </w:tc>
         <w:tc>
           <w:tcPr>
-            <w:tcW w:type="dxa" w:w="2256"/>
+            <w:tcW w:type="dxa" w:w="1504"/>
           </w:tcPr>
           <w:p>
             <w:pPr>
@@ -3806,7 +4014,7 @@
         </w:tc>
         <w:tc>
           <w:tcPr>
-            <w:tcW w:type="dxa" w:w="2256"/>
+            <w:tcW w:type="dxa" w:w="1504"/>
           </w:tcPr>
           <w:p>
             <w:pPr>
@@ -3825,7 +4033,7 @@
         </w:tc>
         <w:tc>
           <w:tcPr>
-            <w:tcW w:type="dxa" w:w="2256"/>
+            <w:tcW w:type="dxa" w:w="1504"/>
           </w:tcPr>
           <w:p>
             <w:pPr>
@@ -3842,11 +4050,49 @@
             </w:r>
           </w:p>
         </w:tc>
+        <w:tc>
+          <w:tcPr>
+            <w:tcW w:type="dxa" w:w="1504"/>
+          </w:tcPr>
+          <w:p>
+            <w:pPr>
+              <w:jc w:val="center"/>
+            </w:pPr>
+            <w:r>
+              <w:rPr>
+                <w:rFonts w:ascii="Times New Roman" w:hAnsi="Times New Roman" w:eastAsia="Times New Roman"/>
+                <w:b w:val="0"/>
+                <w:i w:val="0"/>
+                <w:sz w:val="18"/>
+              </w:rPr>
+              <w:t>0.02</w:t>
+            </w:r>
+          </w:p>
+        </w:tc>
+        <w:tc>
+          <w:tcPr>
+            <w:tcW w:type="dxa" w:w="1504"/>
+          </w:tcPr>
+          <w:p>
+            <w:pPr>
+              <w:jc w:val="center"/>
+            </w:pPr>
+            <w:r>
+              <w:rPr>
+                <w:rFonts w:ascii="Times New Roman" w:hAnsi="Times New Roman" w:eastAsia="Times New Roman"/>
+                <w:b w:val="0"/>
+                <w:i w:val="0"/>
+                <w:sz w:val="18"/>
+              </w:rPr>
+              <w:t>1.34</w:t>
+            </w:r>
+          </w:p>
+        </w:tc>
       </w:tr>
       <w:tr>
         <w:tc>
           <w:tcPr>
-            <w:tcW w:type="dxa" w:w="2256"/>
+            <w:tcW w:type="dxa" w:w="1504"/>
           </w:tcPr>
           <w:p>
             <w:pPr>
@@ -3859,13 +4105,13 @@
                 <w:i w:val="0"/>
                 <w:sz w:val="18"/>
               </w:rPr>
-              <w:t>edad</w:t>
+              <w:t>Edad</w:t>
             </w:r>
           </w:p>
         </w:tc>
         <w:tc>
           <w:tcPr>
-            <w:tcW w:type="dxa" w:w="2256"/>
+            <w:tcW w:type="dxa" w:w="1504"/>
           </w:tcPr>
           <w:p>
             <w:pPr>
@@ -3884,7 +4130,7 @@
         </w:tc>
         <w:tc>
           <w:tcPr>
-            <w:tcW w:type="dxa" w:w="2256"/>
+            <w:tcW w:type="dxa" w:w="1504"/>
           </w:tcPr>
           <w:p>
             <w:pPr>
@@ -3903,7 +4149,7 @@
         </w:tc>
         <w:tc>
           <w:tcPr>
-            <w:tcW w:type="dxa" w:w="2256"/>
+            <w:tcW w:type="dxa" w:w="1504"/>
           </w:tcPr>
           <w:p>
             <w:pPr>
@@ -3917,6 +4163,44 @@
                 <w:sz w:val="18"/>
               </w:rPr>
               <w:t>0.039</w:t>
+            </w:r>
+          </w:p>
+        </w:tc>
+        <w:tc>
+          <w:tcPr>
+            <w:tcW w:type="dxa" w:w="1504"/>
+          </w:tcPr>
+          <w:p>
+            <w:pPr>
+              <w:jc w:val="center"/>
+            </w:pPr>
+            <w:r>
+              <w:rPr>
+                <w:rFonts w:ascii="Times New Roman" w:hAnsi="Times New Roman" w:eastAsia="Times New Roman"/>
+                <w:b w:val="0"/>
+                <w:i w:val="0"/>
+                <w:sz w:val="18"/>
+              </w:rPr>
+              <w:t>0.026</w:t>
+            </w:r>
+          </w:p>
+        </w:tc>
+        <w:tc>
+          <w:tcPr>
+            <w:tcW w:type="dxa" w:w="1504"/>
+          </w:tcPr>
+          <w:p>
+            <w:pPr>
+              <w:jc w:val="center"/>
+            </w:pPr>
+            <w:r>
+              <w:rPr>
+                <w:rFonts w:ascii="Times New Roman" w:hAnsi="Times New Roman" w:eastAsia="Times New Roman"/>
+                <w:b w:val="0"/>
+                <w:i w:val="0"/>
+                <w:sz w:val="18"/>
+              </w:rPr>
+              <w:t>1.51</w:t>
             </w:r>
           </w:p>
         </w:tc>
@@ -4018,7 +4302,7 @@
           <w:i w:val="0"/>
           <w:sz w:val="24"/>
         </w:rPr>
-        <w:t>Se presentó un pipeline reproducible de ciencia de datos que, sobre 14,8 millones de lecturas reales de CGM, estratifica objetivamente a pacientes con DM1 según los criterios de candidatura a trasplante de islotes. La variabilidad glucémica alta y el tiempo en rango insuficiente son muy frecuentes, pero el perfil de labilidad severa es minoritario (3,5%), lo que respalda una selección estricta de candidatos. La hipoglucemia inadvertida se asoció a la duración de la enfermedad y a la edad más que al CGM del momento.</w:t>
+        <w:t>Se presentó un pipeline reproducible de ciencia de datos que, sobre 14,8 millones de lecturas reales de CGM, estratifica objetivamente a pacientes con DM1 según los criterios de candidatura a trasplante de islotes. La variabilidad glucémica alta y el tiempo en rango insuficiente son muy frecuentes, pero el perfil de labilidad severa es minoritario (3,5%), lo que respalda una selección estricta de candidatos. La hipoglucemia inadvertida se asoció a la duración de la enfermedad y a la edad más que al CGM del momento. El aporte, desde la informática, es un pipeline reproducible y un modelo de aprendizaje automático interpretable que materializa el paradigma del factor humano de la IA (Humanware 5.0): un sistema de apoyo a la decisión que asiste —sin reemplazar— el juicio clínico.</w:t>
       </w:r>
     </w:p>
     <w:p>
@@ -4094,7 +4378,7 @@
           <w:i w:val="0"/>
           <w:sz w:val="20"/>
         </w:rPr>
-        <w:t>[3] C. Ricordi, J. S. Goldstein, A. N. Balamurugan et al., "NIH-sponsored Clinical Islet Transplantation Consortium Phase 3 Trial", Diabetes, vol. 65, pp. 3418–3428, 2016.</w:t>
+        <w:t>[3] N. M. Paucara Saavedra, "¿Cura a la diabetes? Avances y desafíos en el trasplante de islotes pancreáticos", XVI Congreso Argentino de Estudiantes de Nutrición, Facultad de Ciencias Médicas, Universidad de Buenos Aires, 2026.</w:t>
       </w:r>
     </w:p>
     <w:p>
@@ -4109,7 +4393,7 @@
           <w:i w:val="0"/>
           <w:sz w:val="20"/>
         </w:rPr>
-        <w:t>[4] A. Gangemi et al., "Islet Transplantation for Brittle Type 1 Diabetes: The UIC Protocol", American Journal of Transplantation, vol. 8, pp. 1250–1261, 2008.</w:t>
+        <w:t>[4] M. Cassola y O. J. Leal Niebla, "Tegoprubart and the CD40L Pathway: Promise and Remaining Questions in CNI-Free Transplantation", BioNatura Journal, 2026.</w:t>
       </w:r>
     </w:p>
     <w:p>
@@ -4124,7 +4408,7 @@
           <w:i w:val="0"/>
           <w:sz w:val="20"/>
         </w:rPr>
-        <w:t>[5] M. R. Rickels y R. P. Robertson, "Pancreatic Islet Transplantation in Humans: Recent Progress and Future Directions", Endocrine Reviews, vol. 40, n.º 2, pp. 631–668, 2019.</w:t>
+        <w:t>[5] Health Quality Ontario, "Pancreas Islet Transplantation for Patients With Type 1 Diabetes Mellitus: A Clinical Evidence Review", Ontario Health Technology Assessment Series, vol. 15, n.º 16, pp. 1–84, 2015.</w:t>
       </w:r>
     </w:p>
     <w:p>
@@ -4139,7 +4423,7 @@
           <w:i w:val="0"/>
           <w:sz w:val="20"/>
         </w:rPr>
-        <w:t>[6] A. M. J. Shapiro, "Islet Transplantation in Type 1 Diabetes: Ongoing Challenges, Refined Procedures, and Long-Term Outcome", The Review of Diabetic Studies, vol. 9, n.º 4, pp. 385–406, 2012.</w:t>
+        <w:t>[6] M. R. Rickels y R. P. Robertson, "Pancreatic Islet Transplantation in Humans: Recent Progress and Future Directions", Endocrine Reviews, vol. 40, n.º 2, pp. 631–668, 2019.</w:t>
       </w:r>
     </w:p>
     <w:p>
@@ -4154,7 +4438,7 @@
           <w:i w:val="0"/>
           <w:sz w:val="20"/>
         </w:rPr>
-        <w:t>[7] A. Bruni et al., "Islet cell transplantation for the treatment of type 1 diabetes: recent advances and future challenges", Diabetes, Metabolic Syndrome and Obesity, vol. 7, pp. 211–223, 2014.</w:t>
+        <w:t>[7] C. Ricordi, J. S. Goldstein, A. N. Balamurugan et al., "NIH-sponsored Clinical Islet Transplantation Consortium Phase 3 Trial", Diabetes, vol. 65, pp. 3418–3428, 2016.</w:t>
       </w:r>
     </w:p>
     <w:p>
@@ -4169,7 +4453,7 @@
           <w:i w:val="0"/>
           <w:sz w:val="20"/>
         </w:rPr>
-        <w:t>[8] Health Quality Ontario, "Pancreas Islet Transplantation for Patients With Type 1 Diabetes Mellitus: A Clinical Evidence Review", Ontario Health Technology Assessment Series, vol. 15, n.º 16, pp. 1–84, 2015.</w:t>
+        <w:t>[8] A. Gangemi et al., "Islet Transplantation for Brittle Type 1 Diabetes: The UIC Protocol", American Journal of Transplantation, vol. 8, pp. 1250–1261, 2008.</w:t>
       </w:r>
     </w:p>
     <w:p>
@@ -4184,7 +4468,7 @@
           <w:i w:val="0"/>
           <w:sz w:val="20"/>
         </w:rPr>
-        <w:t>[9] N. M. Paucara Saavedra, "¿Cura a la diabetes? Avances y desafíos en el trasplante de islotes pancreáticos", XVI Congreso Argentino de Estudiantes de Nutrición, Facultad de Ciencias Médicas, Universidad de Buenos Aires, 2026.</w:t>
+        <w:t>[9] A. Bruni et al., "Islet cell transplantation for the treatment of type 1 diabetes: recent advances and future challenges", Diabetes, Metabolic Syndrome and Obesity, vol. 7, pp. 211–223, 2014.</w:t>
       </w:r>
     </w:p>
     <w:p>
@@ -4199,7 +4483,7 @@
           <w:i w:val="0"/>
           <w:sz w:val="20"/>
         </w:rPr>
-        <w:t>[10] M. Cassola y O. J. Leal Niebla, "Tegoprubart and the CD40L Pathway: Promise and Remaining Questions in CNI-Free Transplantation", BioNatura Journal, 2026.</w:t>
+        <w:t>[10] A. M. J. Shapiro, "Islet Transplantation in Type 1 Diabetes: Ongoing Challenges, Refined Procedures, and Long-Term Outcome", The Review of Diabetic Studies, vol. 9, n.º 4, pp. 385–406, 2012.</w:t>
       </w:r>
     </w:p>
     <w:p>

</xml_diff>

<commit_message>
Enfoque '¿Cura la diabetes?' + formato Referencia.docx (11 pt, cursivas)
- Título, resumen y abstract reescritos con voz narrativa (promesa del trasplante,
  tegoprubart, a quién conviene) sin autoetiquetas de disciplina ni prosa-catálogo.
- Formato alineado a Referencia.docx: cuerpo 11 pt Times, resumen/abstract y emails
  en cursiva.
- Se añade IC 95% de Wilson del 3,5% (1,8-6,8%), nota de eventos/variable en la
  logística y párrafos de discusión (dimensión del problema y era de nuevas terapias).
</commit_message>
<xml_diff>
--- a/paper/Labilidad_Glucemica_Trasplante_Islotes_DM1_UAI.docx
+++ b/paper/Labilidad_Glucemica_Trasplante_Islotes_DM1_UAI.docx
@@ -14,7 +14,7 @@
           <w:i w:val="0"/>
           <w:sz w:val="28"/>
         </w:rPr>
-        <w:t>Aprendizaje automático interpretable para la estratificación de candidatos a trasplante de islotes en diabetes tipo 1: un sistema de apoyo a la decisión sobre datos reales de monitoreo continuo de glucosa</w:t>
+        <w:t>¿Cura la diabetes? Avances y desafíos del trasplante de islotes pancreáticos y la selección de candidatos a partir de datos reales de monitoreo continuo de glucosa</w:t>
       </w:r>
     </w:p>
     <w:p>
@@ -29,7 +29,7 @@
           <w:i/>
           <w:sz w:val="22"/>
         </w:rPr>
-        <w:t>Interpretable Machine Learning for Stratifying Islet Transplantation Candidates in Type 1 Diabetes: A Clinical Decision-Support Approach on Real-World Continuous Glucose Monitoring Data</w:t>
+        <w:t>Does It Cure Diabetes? Advances and Challenges of Pancreatic Islet Transplantation and Candidate Selection Using Real-World Continuous Glucose Monitoring Data</w:t>
       </w:r>
     </w:p>
     <w:p>
@@ -42,7 +42,7 @@
           <w:rFonts w:ascii="Times New Roman" w:hAnsi="Times New Roman" w:eastAsia="Times New Roman"/>
           <w:b w:val="0"/>
           <w:i w:val="0"/>
-          <w:sz w:val="24"/>
+          <w:sz w:val="22"/>
         </w:rPr>
         <w:t>Magali Bolivar, María Florencia Rossi, Matías Montiel, Nestor Balich, Franco Balich</w:t>
       </w:r>
@@ -57,7 +57,7 @@
           <w:rFonts w:ascii="Times New Roman" w:hAnsi="Times New Roman" w:eastAsia="Times New Roman"/>
           <w:b w:val="0"/>
           <w:i w:val="0"/>
-          <w:sz w:val="24"/>
+          <w:sz w:val="22"/>
         </w:rPr>
         <w:t>CAETI - Centro de Altos Estudios en Tecnología Informática</w:t>
       </w:r>
@@ -72,7 +72,7 @@
           <w:rFonts w:ascii="Times New Roman" w:hAnsi="Times New Roman" w:eastAsia="Times New Roman"/>
           <w:b w:val="0"/>
           <w:i w:val="0"/>
-          <w:sz w:val="24"/>
+          <w:sz w:val="22"/>
         </w:rPr>
         <w:t>Universidad Abierta Interamericana. Informática (UAI)</w:t>
       </w:r>
@@ -87,7 +87,7 @@
           <w:rFonts w:ascii="Times New Roman" w:hAnsi="Times New Roman" w:eastAsia="Times New Roman"/>
           <w:b w:val="0"/>
           <w:i w:val="0"/>
-          <w:sz w:val="24"/>
+          <w:sz w:val="22"/>
         </w:rPr>
         <w:t>Montes de Oca 745. Ciudad Autónoma de Buenos Aires, Argentina.</w:t>
       </w:r>
@@ -101,8 +101,8 @@
         <w:rPr>
           <w:rFonts w:ascii="Times New Roman" w:hAnsi="Times New Roman" w:eastAsia="Times New Roman"/>
           <w:b w:val="0"/>
-          <w:i w:val="0"/>
-          <w:sz w:val="24"/>
+          <w:i/>
+          <w:sz w:val="22"/>
         </w:rPr>
         <w:t>{MagaliFlorencia.BolivarCruz, MariaFlorencia.Rossi, MatiasNicolas.MontielTorres}@alumnos.uai.edu.ar</w:t>
       </w:r>
@@ -116,8 +116,8 @@
         <w:rPr>
           <w:rFonts w:ascii="Times New Roman" w:hAnsi="Times New Roman" w:eastAsia="Times New Roman"/>
           <w:b w:val="0"/>
-          <w:i w:val="0"/>
-          <w:sz w:val="24"/>
+          <w:i/>
+          <w:sz w:val="22"/>
         </w:rPr>
         <w:t>{nestor.balich, francoadrian.balich}@uai.edu.ar</w:t>
       </w:r>
@@ -146,10 +146,10 @@
         <w:rPr>
           <w:rFonts w:ascii="Times New Roman" w:hAnsi="Times New Roman" w:eastAsia="Times New Roman"/>
           <w:b w:val="0"/>
-          <w:i w:val="0"/>
-          <w:sz w:val="24"/>
+          <w:i/>
+          <w:sz w:val="22"/>
         </w:rPr>
-        <w:t>El trasplante alogénico de islotes pancreáticos (Protocolo Edmonton) es una alternativa terapéutica para la diabetes mellitus tipo 1 (DM1), reservada para pacientes con inestabilidad metabólica severa e hipoglucemias inadvertidas, dado que exige inmunosupresión crónica con riesgo de toxicidad. Nuevas terapias como el tegoprubart (anticuerpo anti-CD40L) buscan reducir esa toxicidad, pero la selección del paciente sigue siendo determinante: el beneficio solo supera al riesgo en quienes presentan un perfil de labilidad glucémica marcada. Este trabajo aplica un pipeline reproducible de ciencia de datos para cuantificar, sobre datos reales, qué proporción de una población de DM1 cumple los criterios de candidatura. Se procesaron 14,8 millones de lecturas de monitoreo continuo de glucosa (CGM) de 226 adultos con DM1 del estudio REPLACE-BG, calculando las métricas del consenso internacional (coeficiente de variación, tiempo en rango y tiempo en hipoglucemia) e integrándolas con cuestionarios de percepción de hipoglucemia. Se operacionalizaron los criterios de Edmonton, se compararon los subgrupos, se segmentaron fenotipos glucémicos (PCA + K-Means) y se estimó una regresión logística de la hipoglucemia inadvertida. La variabilidad glucémica alta (%CV ≥ 36%) afectó al 64,6% de la cohorte y la hipoglucemia inadvertida al 17,3%, pero solo el 3,5% reunió el perfil completo de labilidad compatible con la indicación de trasplante. La hipoglucemia inadvertida se asoció a la duración de la DM1 y a la edad, y no a las métricas de CGM del momento. Los resultados aportan una herramienta objetiva y reproducible para priorizar candidatos y respaldan cuantitativamente que el trasplante debe reservarse para un subgrupo minoritario y bien caracterizado. Desde la perspectiva de la informática, el aporte central es un pipeline de ciencia de datos escalable y un sistema de aprendizaje automático interpretable que, en línea con el paradigma del factor humano de la inteligencia artificial (Humanware 5.0), no reemplaza el juicio clínico sino que lo asiste con evidencia cuantitativa y trazable.</w:t>
+        <w:t>El trasplante de islotes pancreáticos promete algo que hasta hace poco parecía inalcanzable: liberar de la insulina a una persona con diabetes tipo 1. El Protocolo Edmonton y, más recientemente, inmunoterapias como el tegoprubart han acercado esa promesa, pero a un costo —la inmunosupresión de por vida— que solo se justifica en los casos más graves: quienes sufren hipoglucemias severas e inadvertidas y una glucemia verdaderamente inestable. La pregunta práctica, entonces, no es solo si el trasplante cura, sino a quién conviene ofrecérselo. Este trabajo la aborda con datos reales: se procesaron 14,8 millones de lecturas de monitoreo continuo de glucosa (CGM) de 226 adultos con diabetes tipo 1 del estudio REPLACE-BG y, a partir de la señal cruda, se reconstruyeron las métricas del consenso internacional —variabilidad, tiempo en rango y tiempo en hipoglucemia— para traducir la 'labilidad' clínica en criterios objetivos y reproducibles. Aunque el mal control resultó frecuente —dos de cada tres pacientes con variabilidad alta o tiempo en rango insuficiente—, solo el 3,5 % reunió el perfil completo que justificaría evaluar un trasplante. Además, la hipoglucemia inadvertida se asoció con los años de enfermedad y la edad, y no con las métricas de glucosa del momento, lo que sugiere que la decisión no puede apoyarse únicamente en el CGM reciente. El resultado es una herramienta objetiva y reproducible para priorizar a los candidatos, que respalda con números la necesidad de una selección estricta.</w:t>
       </w:r>
     </w:p>
     <w:p>
@@ -162,7 +162,7 @@
           <w:rFonts w:ascii="Times New Roman" w:hAnsi="Times New Roman" w:eastAsia="Times New Roman"/>
           <w:b/>
           <w:i w:val="0"/>
-          <w:sz w:val="24"/>
+          <w:sz w:val="22"/>
         </w:rPr>
         <w:t xml:space="preserve">Palabras clave: </w:t>
       </w:r>
@@ -170,10 +170,10 @@
         <w:rPr>
           <w:rFonts w:ascii="Times New Roman" w:hAnsi="Times New Roman" w:eastAsia="Times New Roman"/>
           <w:b w:val="0"/>
-          <w:i w:val="0"/>
-          <w:sz w:val="24"/>
+          <w:i/>
+          <w:sz w:val="22"/>
         </w:rPr>
-        <w:t>aprendizaje automático interpretable; sistema de apoyo a la decisión; monitoreo continuo de glucosa; diabetes tipo 1; trasplante de islotes; ciencia de datos.</w:t>
+        <w:t>trasplante de islotes; diabetes tipo 1; monitoreo continuo de glucosa; labilidad glucémica; estratificación de candidatos; ciencia de datos.</w:t>
       </w:r>
     </w:p>
     <w:p>
@@ -201,9 +201,9 @@
           <w:rFonts w:ascii="Times New Roman" w:hAnsi="Times New Roman" w:eastAsia="Times New Roman"/>
           <w:b w:val="0"/>
           <w:i/>
-          <w:sz w:val="24"/>
+          <w:sz w:val="22"/>
         </w:rPr>
-        <w:t>Allogeneic pancreatic islet transplantation (Edmonton Protocol) is a therapeutic option for type 1 diabetes (T1D), reserved for patients with severe metabolic instability and impaired awareness of hypoglycemia, since it requires chronic immunosuppression with toxicity risk. Novel therapies such as tegoprubart (anti-CD40L antibody) aim to reduce that toxicity, but patient selection remains decisive: the benefit outweighs the risk only in those with marked glycemic lability. This work applies a reproducible data-science pipeline to quantify, on real-world data, what fraction of a T1D population meets candidacy criteria. We processed 14.8 million continuous glucose monitoring (CGM) readings from 226 adults with T1D from the REPLACE-BG study, computing international-consensus metrics and integrating them with hypoglycemia perception questionnaires. High glycemic variability (%CV ≥ 36%) affected 64.6% of the cohort and impaired awareness of hypoglycemia 17.3%, yet only 3.5% met the full lability profile compatible with transplant indication. Impaired awareness was associated with T1D duration and age rather than with current CGM metrics. The results provide an objective, reproducible tool to prioritize candidates and quantitatively support reserving transplantation for a small, well-characterized subgroup. From an informatics standpoint, the main contribution is a scalable data-science pipeline and an interpretable machine-learning system that, in line with the human-factor-of-AI paradigm (Humanware 5.0), assists—rather than replaces—clinical judgment with quantitative, traceable evidence.</w:t>
+        <w:t>Pancreatic islet transplantation offers something long thought out of reach: freeing a person with type 1 diabetes from insulin. The Edmonton Protocol and, more recently, immunotherapies such as tegoprubart have brought that promise closer, but at a cost —lifelong immunosuppression— that is only justified in the most severe cases: patients with severe, impaired-awareness hypoglycemia and truly unstable glucose. The practical question is therefore not only whether transplantation cures, but for whom it is worth it. We address it with real data: we processed 14.8 million continuous glucose monitoring (CGM) readings from 226 adults with type 1 diabetes in the REPLACE-BG study and, from the raw signal, reconstructed the international-consensus metrics —variability, time in range and time in hypoglycemia— to turn clinical 'lability' into objective, reproducible criteria. Although poor control was common —two of every three patients had high variability or insufficient time in range— only 3.5% met the full profile that would justify evaluating a transplant. Moreover, impaired awareness of hypoglycemia was associated with disease duration and age rather than current glucose metrics, suggesting the decision cannot rest on recent CGM alone. The result is an objective, reproducible tool to prioritize candidates that quantitatively supports strict selection.</w:t>
       </w:r>
     </w:p>
     <w:p>
@@ -216,7 +216,7 @@
           <w:rFonts w:ascii="Times New Roman" w:hAnsi="Times New Roman" w:eastAsia="Times New Roman"/>
           <w:b/>
           <w:i/>
-          <w:sz w:val="24"/>
+          <w:sz w:val="22"/>
         </w:rPr>
         <w:t xml:space="preserve">Keywords: </w:t>
       </w:r>
@@ -225,9 +225,9 @@
           <w:rFonts w:ascii="Times New Roman" w:hAnsi="Times New Roman" w:eastAsia="Times New Roman"/>
           <w:b w:val="0"/>
           <w:i/>
-          <w:sz w:val="24"/>
+          <w:sz w:val="22"/>
         </w:rPr>
-        <w:t>interpretable machine learning; clinical decision support; continuous glucose monitoring; type 1 diabetes; islet transplantation; data science.</w:t>
+        <w:t>islet transplantation; type 1 diabetes; continuous glucose monitoring; glycemic lability; candidate stratification; data science.</w:t>
       </w:r>
     </w:p>
     <w:p>
@@ -256,7 +256,7 @@
           <w:rFonts w:ascii="Times New Roman" w:hAnsi="Times New Roman" w:eastAsia="Times New Roman"/>
           <w:b w:val="0"/>
           <w:i w:val="0"/>
-          <w:sz w:val="24"/>
+          <w:sz w:val="22"/>
         </w:rPr>
         <w:t>La diabetes mellitus tipo 1 (DM1) se caracteriza por la destrucción autoinmune de las células beta pancreáticas, lo que genera una dependencia absoluta de la insulina exógena. Pese a los avances en insulinoterapia y en tecnología de administración, una subpoblación de pacientes experimenta labilidad glucémica extrema, con hipoglucemias severas recurrentes e hipoglucemia inadvertida —un síndrome de falla autonómica que eleva de forma drástica la morbimortalidad—. En este escenario, el trasplante alogénico de islotes pancreáticos ha emergido como una intervención capaz de restaurar la masa de células beta y la homeostasis glucémica [1], [2].</w:t>
       </w:r>
@@ -272,7 +272,7 @@
           <w:rFonts w:ascii="Times New Roman" w:hAnsi="Times New Roman" w:eastAsia="Times New Roman"/>
           <w:b w:val="0"/>
           <w:i w:val="0"/>
-          <w:sz w:val="24"/>
+          <w:sz w:val="22"/>
         </w:rPr>
         <w:t>Sin embargo, el trasplante exige inmunosupresión crónica (habitualmente tacrolimus y sirolimus) con riesgo de nefrotoxicidad, infecciones y neoplasias, por lo que se reserva para pacientes con inestabilidad metabólica severa. Ensayos recientes con tegoprubart, un anticuerpo monoclonal anti-CD40L, muestran resultados prometedores en independencia de insulina con menor toxicidad [3], [4], pero no eliminan la premisa central: la relación riesgo-beneficio solo es favorable en pacientes cuidadosamente seleccionados. Como concluye la literatura, en pacientes con buen control metabólico y baja variabilidad glucémica el procedimiento presenta más riesgos que beneficios.</w:t>
       </w:r>
@@ -288,7 +288,7 @@
           <w:rFonts w:ascii="Times New Roman" w:hAnsi="Times New Roman" w:eastAsia="Times New Roman"/>
           <w:b w:val="0"/>
           <w:i w:val="0"/>
-          <w:sz w:val="24"/>
+          <w:sz w:val="22"/>
         </w:rPr>
         <w:t>La selección de candidatos, no obstante, se apoya con frecuencia en criterios clínicos cualitativos. El monitoreo continuo de glucosa (CGM) permite cuantificar de manera objetiva la variabilidad y la exposición a hipoglucemia. El objetivo de este trabajo es construir, con datos reales y un pipeline reproducible, una estratificación objetiva de candidatos a trasplante de islotes, cuantificando en una población de DM1 la prevalencia de los criterios de labilidad glucémica que definen la indicación.</w:t>
       </w:r>
@@ -304,9 +304,9 @@
           <w:rFonts w:ascii="Times New Roman" w:hAnsi="Times New Roman" w:eastAsia="Times New Roman"/>
           <w:b w:val="0"/>
           <w:i w:val="0"/>
-          <w:sz w:val="24"/>
+          <w:sz w:val="22"/>
         </w:rPr>
-        <w:t>Desde la óptica de la informática, el trabajo aborda tres desafíos característicos de la ciencia de datos en salud: (i) la ingeniería de datos a gran escala —el procesamiento en flujo (streaming) de casi 15 millones de registros de sensores—; (ii) la construcción de variables clínicas interpretables a partir de señales crudas; y (iii) el uso de modelos de aprendizaje automático interpretables (segmentación no supervisada y regresión) como soporte a la decisión. Este enfoque se alinea con el paradigma del factor humano de la inteligencia artificial (Humanware 5.0): la IA no sustituye al profesional, sino que amplifica su capacidad de decidir con evidencia objetiva, trazable y reproducible.</w:t>
+        <w:t>El desafío no es menor del lado de los datos. Trabajar con casi 15 millones de registros de sensor obliga a procesarlos en flujo, sin cargarlos enteros en memoria, y a reconstruir a partir de la señal cruda las variables clínicas que realmente importan; recién sobre esa base tiene sentido buscar patrones y modelar el riesgo. Ese recorrido —de la señal al criterio de candidatura— se documentó de principio a fin para que cualquier equipo pueda repetirlo y auditarlo, y se concibió como apoyo a la decisión clínica: una herramienta que ordena la evidencia, no que reemplaza el juicio del profesional.</w:t>
       </w:r>
     </w:p>
     <w:p>
@@ -335,7 +335,7 @@
           <w:rFonts w:ascii="Times New Roman" w:hAnsi="Times New Roman" w:eastAsia="Times New Roman"/>
           <w:b w:val="0"/>
           <w:i w:val="0"/>
-          <w:sz w:val="24"/>
+          <w:sz w:val="22"/>
         </w:rPr>
         <w:t>El Protocolo Edmonton estableció la viabilidad del trasplante de islotes con un régimen inmunosupresor libre de glucocorticoides [1] y fue validado en un ensayo internacional multicéntrico [2]. Su indicación se reserva para la DM1 con hipoglucemias severas e inadvertidas y labilidad metabólica [5], [6]. Los ensayos de fase 3 del Clinical Islet Transplantation Consortium [7] y protocolos como el de la Universidad de Illinois para la 'brittle diabetes' [8] consolidaron su eficacia sobre la hipoglucemia, aunque la toxicidad inmunosupresora y la escasez de donantes siguen limitando su alcance [9], [10].</w:t>
       </w:r>
@@ -351,7 +351,7 @@
           <w:rFonts w:ascii="Times New Roman" w:hAnsi="Times New Roman" w:eastAsia="Times New Roman"/>
           <w:b w:val="0"/>
           <w:i w:val="0"/>
-          <w:sz w:val="24"/>
+          <w:sz w:val="22"/>
         </w:rPr>
         <w:t>La hipoglucemia inadvertida (impaired awareness of hypoglycemia, IAH) —la pérdida de los síntomas de alarma— es el eje de la indicación: multiplica el riesgo de hipoglucemia severa. Por su parte, el consenso internacional sobre interpretación del CGM [11] define objetivos estandarizados: tiempo en rango (TIR 70–180 mg/dL) ≥ 70%, tiempo por debajo de rango (TBR &lt;54 mg/dL) &lt; 1% y coeficiente de variación (%CV) &lt; 36% como umbral de estabilidad glucémica. Estas métricas permiten traducir la 'labilidad' clínica en variables objetivas y reproducibles, base de la estratificación que se propone.</w:t>
       </w:r>
@@ -367,7 +367,7 @@
           <w:rFonts w:ascii="Times New Roman" w:hAnsi="Times New Roman" w:eastAsia="Times New Roman"/>
           <w:b w:val="0"/>
           <w:i w:val="0"/>
-          <w:sz w:val="24"/>
+          <w:sz w:val="22"/>
         </w:rPr>
         <w:t>El principal obstáculo del trasplante es la toxicidad de la inmunosupresión crónica. Para superarlo, los ensayos de Eledon Pharmaceuticals (2024–2026) evaluaron el tegoprubart, un anticuerpo monoclonal anti-CD40L que bloquea la coestimulación linfocitaria: en un estudio piloto con 12 adultos, la totalidad alcanzó independencia de insulina con HbA1c inferior al 6,0% y buena tolerancia, sin nefrotoxicidad ni infecciones oportunistas [3], [4]. Persisten, sin embargo, limitaciones como la necesidad de infusiones intravenosas periódicas, la escasez de donantes y un seguimiento a largo plazo aún en curso. En la Argentina, el procedimiento se enmarca en la normativa del INCUCAI y se reserva para casos de DM1 con inestabilidad metabólica severa, lo que vuelve crítica una estratificación objetiva de candidatos y el abordaje por equipos multidisciplinarios. En este contexto, disponer de una herramienta cuantitativa y reproducible para priorizar la evaluación pretrasplante adquiere particular relevancia.</w:t>
       </w:r>
@@ -412,7 +412,7 @@
           <w:rFonts w:ascii="Times New Roman" w:hAnsi="Times New Roman" w:eastAsia="Times New Roman"/>
           <w:b w:val="0"/>
           <w:i w:val="0"/>
-          <w:sz w:val="24"/>
+          <w:sz w:val="22"/>
         </w:rPr>
         <w:t>Se utilizó el conjunto de datos público REPLACE-BG [12] (Jaeb Center for Health Research), un ensayo clínico aleatorizado en 226 adultos con DM1 de larga data y buen control basal (HbA1c 6,4–9,0%). El dataset incluye el registro completo de CGM (14,8 millones de lecturas), datos de cribado (demografía, antecedentes), determinaciones de HbA1c y cuestionarios de percepción de hipoglucemia. El acceso es de descarga directa para investigación.</w:t>
       </w:r>
@@ -442,7 +442,7 @@
           <w:rFonts w:ascii="Times New Roman" w:hAnsi="Times New Roman" w:eastAsia="Times New Roman"/>
           <w:b w:val="0"/>
           <w:i w:val="0"/>
-          <w:sz w:val="24"/>
+          <w:sz w:val="22"/>
         </w:rPr>
         <w:t>A partir del archivo crudo de CGM se calcularon, por paciente, las métricas del consenso internacional [11]: glucosa media, coeficiente de variación (%CV = desvío estándar / media), indicador de gestión de la glucosa (GMI), tiempo en rango (TIR 70–180 mg/dL), tiempo por debajo de rango (TBR &lt;70 y &lt;54 mg/dL) y tiempo por encima de rango (TAR &gt;180 y &gt;250 mg/dL). El procesamiento se realizó en flujo (streaming) sobre el archivo de 837 MB, acumulando estadísticos sin cargarlo íntegramente en memoria, lo que garantiza la reproducibilidad y la escalabilidad del pipeline (Python, pandas).</w:t>
       </w:r>
@@ -472,7 +472,7 @@
           <w:rFonts w:ascii="Times New Roman" w:hAnsi="Times New Roman" w:eastAsia="Times New Roman"/>
           <w:b w:val="0"/>
           <w:i w:val="0"/>
-          <w:sz w:val="24"/>
+          <w:sz w:val="22"/>
         </w:rPr>
         <w:t>Los criterios de la indicación de trasplante se operacionalizaron combinando los cuestionarios y las métricas de CGM: (i) hipoglucemia inadvertida (IAH), definida por la pérdida de los síntomas de alarma; (ii) variabilidad glucémica alta (%CV ≥ 36%); (iii) exposición excesiva a hipoglucemia (TBR &lt;54 &gt; 1%); y (iv) tiempo en rango insuficiente (TIR &lt; 70%). El perfil de labilidad glucémica —proxy de la candidatura de Edmonton— se definió como la coexistencia de hipoglucemia inadvertida y exposición excesiva a hipoglucemia. El análisis incluyó estadística descriptiva, comparación entre subgrupos (prueba t de Welch), segmentación no supervisada de fenotipos glucémicos mediante estandarización, PCA y K-Means (k=3) con scikit-learn [13], y una regresión logística de la hipoglucemia inadvertida con statsmodels [14], en función de las métricas de CGM, la duración de la enfermedad y la edad.</w:t>
       </w:r>
@@ -517,7 +517,7 @@
           <w:rFonts w:ascii="Times New Roman" w:hAnsi="Times New Roman" w:eastAsia="Times New Roman"/>
           <w:b w:val="0"/>
           <w:i w:val="0"/>
-          <w:sz w:val="24"/>
+          <w:sz w:val="22"/>
         </w:rPr>
         <w:t>La cohorte (N=226) tenía una edad media de 44,0 años, una duración media de la DM1 de 23,3 años y una HbA1c basal media de 7,3%, con equilibrio por sexo (Tabla 1). Pese al buen control aparente, las métricas de CGM revelaron una carga glucémica considerable: TIR medio del 63,1%, %CV medio del 37,4% y un tiempo en hipoglucemia &lt;54 mg/dL del 1,0% de media.</w:t>
       </w:r>
@@ -1099,9 +1099,9 @@
           <w:rFonts w:ascii="Times New Roman" w:hAnsi="Times New Roman" w:eastAsia="Times New Roman"/>
           <w:b w:val="0"/>
           <w:i w:val="0"/>
-          <w:sz w:val="24"/>
+          <w:sz w:val="22"/>
         </w:rPr>
-        <w:t>La mayoría de la cohorte no alcanzaba los objetivos de consenso: el 71,7% presentaba un TIR insuficiente y el 64,6% una variabilidad glucémica alta (Figura 1, Tabla 2). La exposición excesiva a hipoglucemia afectaba al 34,5% y la hipoglucemia inadvertida al 17,3%. Sin embargo, al exigir el perfil completo de labilidad (hipoglucemia inadvertida más exposición excesiva a hipoglucemia), solo el 3,5% de la cohorte (8 pacientes) reunía la condición compatible con la indicación de trasplante. La Figura 2 muestra las distribuciones de las métricas clave frente a los umbrales de consenso.</w:t>
+        <w:t>La mayoría de la cohorte no alcanzaba los objetivos de consenso: el 71,7% presentaba un TIR insuficiente y el 64,6% una variabilidad glucémica alta (Figura 1, Tabla 2). La exposición excesiva a hipoglucemia afectaba al 34,5% y la hipoglucemia inadvertida al 17,3%. Sin embargo, al exigir el perfil completo de labilidad (hipoglucemia inadvertida más exposición excesiva a hipoglucemia), solo el 3,5% de la cohorte (8 pacientes) reunía la condición compatible con la indicación de trasplante (intervalo de confianza del 95% de Wilson: 1,8–6,8%). La Figura 2 muestra las distribuciones de las métricas clave frente a los umbrales de consenso.</w:t>
       </w:r>
     </w:p>
     <w:p>
@@ -1626,7 +1626,7 @@
           <w:rFonts w:ascii="Times New Roman" w:hAnsi="Times New Roman" w:eastAsia="Times New Roman"/>
           <w:b w:val="0"/>
           <w:i w:val="0"/>
-          <w:sz w:val="24"/>
+          <w:sz w:val="22"/>
         </w:rPr>
         <w:t>El mapa de riesgo (Figura 3) evidencia una relación positiva entre la variabilidad glucémica y la exposición a hipoglucemia: los pacientes con perfil de labilidad se concentran en el cuadrante de %CV y TBR&lt;54 elevados. La segmentación no supervisada (Figura 4, Tabla 4) identificó tres fenotipos glucémicos: uno de buen control (mayor TIR, menor variabilidad), uno hiperglucémico (glucosa media y TAR elevados con TIR bajo) y uno lábil (alta variabilidad y mayor exposición a hipoglucemia), que concentra los perfiles de candidatura. La comparación entre el subgrupo con perfil de labilidad y el resto (Tabla 3) confirma diferencias marcadas en variabilidad y tiempo en hipoglucemia.</w:t>
       </w:r>
@@ -3273,7 +3273,7 @@
           <w:rFonts w:ascii="Times New Roman" w:hAnsi="Times New Roman" w:eastAsia="Times New Roman"/>
           <w:b w:val="0"/>
           <w:i w:val="0"/>
-          <w:sz w:val="24"/>
+          <w:sz w:val="22"/>
         </w:rPr>
         <w:t>La matriz de correlación entre las métricas de CGM (Figura 6) confirma la coherencia interna de los indicadores: la variabilidad (%CV) se asocia positivamente con la exposición a hipoglucemia (TBR&lt;54) y negativamente con el tiempo en rango, mientras que el score de riesgo glucémico resume de forma compacta esta estructura, correlacionando de manera fuerte con las variables que penalizan el control.</w:t>
       </w:r>
@@ -3358,9 +3358,9 @@
           <w:rFonts w:ascii="Times New Roman" w:hAnsi="Times New Roman" w:eastAsia="Times New Roman"/>
           <w:b w:val="0"/>
           <w:i w:val="0"/>
-          <w:sz w:val="24"/>
+          <w:sz w:val="22"/>
         </w:rPr>
-        <w:t>La regresión logística (Tabla 5) mostró que la hipoglucemia inadvertida se asocia de manera significativa con la duración de la DM1 (OR≈1,04 por año; p=0,016) y con la edad (OR≈1,04; p=0,039), pero no con las métricas de CGM del período de observación (%CV, TBR&lt;54, TIR). Este resultado es coherente con la naturaleza crónica y autonómica de la falla en la percepción de hipoglucemia: la IAH refleja años de exposición acumulada más que el estado glucémico puntual, lo que refuerza la necesidad de combinar cuestionarios clínicos con métricas objetivas para identificar candidatos. El modelo es globalmente significativo (test de razón de verosimilitud, p&lt;0,001) y no presenta multicolinealidad (VIF &lt; 2,4 en todos los predictores); la significación de la duración y la edad se mantiene bajo errores estándar robustos (HC1), lo que respalda la solidez del resultado.</w:t>
+        <w:t>La regresión logística (Tabla 5) mostró que la hipoglucemia inadvertida se asocia de manera significativa con la duración de la DM1 (OR≈1,04 por año; p=0,016) y con la edad (OR≈1,04; p=0,039), pero no con las métricas de CGM del período de observación (%CV, TBR&lt;54, TIR). Este resultado es coherente con la naturaleza crónica y autonómica de la falla en la percepción de hipoglucemia: la IAH refleja años de exposición acumulada más que el estado glucémico puntual, lo que refuerza la necesidad de combinar cuestionarios clínicos con métricas objetivas para identificar candidatos. El modelo es globalmente significativo (test de razón de verosimilitud, p&lt;0,001) y no presenta multicolinealidad (VIF &lt; 2,4 en todos los predictores); la significación de la duración y la edad se mantiene bajo errores estándar robustos (HC1), lo que respalda la solidez del resultado. Con 39 eventos de hipoglucemia inadvertida para cinco predictores —cerca de ocho eventos por variable—, el modelo se mantiene dentro de los márgenes habituales de estabilidad, aunque sus estimaciones deben leerse con la prudencia propia de una muestra acotada.</w:t>
       </w:r>
     </w:p>
     <w:p>
@@ -4237,7 +4237,7 @@
           <w:rFonts w:ascii="Times New Roman" w:hAnsi="Times New Roman" w:eastAsia="Times New Roman"/>
           <w:b w:val="0"/>
           <w:i w:val="0"/>
-          <w:sz w:val="24"/>
+          <w:sz w:val="22"/>
         </w:rPr>
         <w:t>Los resultados cuantifican una intuición clínica central del trasplante de islotes: aunque la carga glucémica subóptima es muy frecuente en la DM1 (dos de cada tres pacientes con variabilidad alta o TIR insuficiente), el perfil de labilidad severa que justifica el riesgo de la inmunosupresión es minoritario (3,5%). Esto respalda de forma empírica la recomendación de reservar el procedimiento —y las nuevas terapias como el tegoprubart— para un subgrupo cuidadosamente seleccionado, y advierte contra una indicación guiada solo por el mal control global.</w:t>
       </w:r>
@@ -4253,7 +4253,23 @@
           <w:rFonts w:ascii="Times New Roman" w:hAnsi="Times New Roman" w:eastAsia="Times New Roman"/>
           <w:b w:val="0"/>
           <w:i w:val="0"/>
-          <w:sz w:val="24"/>
+          <w:sz w:val="22"/>
+        </w:rPr>
+        <w:t>Ese 3,5% ayuda además a dimensionar el problema. Proyectado sobre el conjunto de personas con diabetes tipo 1, incluso una fracción pequeña representa un número nada despreciable de candidatos potenciales que hoy podrían no estar siendo identificados de manera sistemática. Al mismo tiempo, la estrechez del grupo explica por qué los programas de trasplante operan con listas reducidas y por qué una selección laxa, guiada solo por el mal control, expondría a muchos pacientes a la toxicidad de la inmunosupresión sin un beneficio proporcional. El valor del enfoque propuesto es, precisamente, ofrecer un criterio cuantitativo y repetible para trazar esa línea con transparencia, allí donde la práctica todavía se apoya en gran medida en la valoración cualitativa.</w:t>
+      </w:r>
+    </w:p>
+    <w:p>
+      <w:pPr>
+        <w:spacing w:after="120"/>
+        <w:ind w:firstLine="283"/>
+        <w:jc w:val="both"/>
+      </w:pPr>
+      <w:r>
+        <w:rPr>
+          <w:rFonts w:ascii="Times New Roman" w:hAnsi="Times New Roman" w:eastAsia="Times New Roman"/>
+          <w:b w:val="0"/>
+          <w:i w:val="0"/>
+          <w:sz w:val="22"/>
         </w:rPr>
         <w:t>El hallazgo de que la hipoglucemia inadvertida depende de la duración y la edad, y no de las métricas de CGM del momento, tiene una implicancia práctica: la estratificación de candidatos no puede basarse únicamente en el CGM reciente, sino que debe integrar la historia clínica y la evaluación de la percepción de hipoglucemia. La combinación de ambas fuentes —como propone este pipeline— ofrece una herramienta objetiva y reproducible para priorizar la evaluación pretrasplante.</w:t>
       </w:r>
@@ -4269,9 +4285,25 @@
           <w:rFonts w:ascii="Times New Roman" w:hAnsi="Times New Roman" w:eastAsia="Times New Roman"/>
           <w:b w:val="0"/>
           <w:i w:val="0"/>
-          <w:sz w:val="24"/>
+          <w:sz w:val="22"/>
         </w:rPr>
-        <w:t>Entre las limitaciones, REPLACE-BG es una población de DM1 con buen control basal en la que la hipoglucemia severa fue criterio de exclusión, por lo que la prevalencia del perfil de labilidad probablemente subestima la de una población con indicación real de trasplante; el diseño es transversal y la definición operacional de candidatura es un proxy de los criterios clínicos completos. No obstante, el marco metodológico es directamente transferible a cohortes de mayor riesgo.</w:t>
+        <w:t>El momento en que se plantea esta pregunta no es casual. Las nuevas inmunoterapias —el tegoprubart y otros esquemas libres de inhibidores de calcineurina— están corriendo la frontera de lo posible: prometen la independencia de insulina con menor toxicidad y, si esa promesa se confirma, ampliarán el universo de pacientes para quienes el trasplante sea una opción razonable. Paradójicamente, eso vuelve más necesaria —y no menos— una selección rigurosa: cuanto más se acerque el trasplante a una verdadera cura, más importará decidir con transparencia quién se beneficia y en qué momento. Un criterio reproducible como el que aquí se propone busca aportar a esa discusión, que todavía descansa en gran medida en la experiencia clínica individual.</w:t>
+      </w:r>
+    </w:p>
+    <w:p>
+      <w:pPr>
+        <w:spacing w:after="120"/>
+        <w:ind w:firstLine="283"/>
+        <w:jc w:val="both"/>
+      </w:pPr>
+      <w:r>
+        <w:rPr>
+          <w:rFonts w:ascii="Times New Roman" w:hAnsi="Times New Roman" w:eastAsia="Times New Roman"/>
+          <w:b w:val="0"/>
+          <w:i w:val="0"/>
+          <w:sz w:val="22"/>
+        </w:rPr>
+        <w:t>Entre las limitaciones, REPLACE-BG es una población de DM1 con buen control basal en la que lahipoglucemia severa fue criterio de exclusión, por lo que la prevalencia del perfil de labilidad probablemente subestima la de una población con indicación real de trasplante; el diseño es transversal y la definición operacional de candidatura es un proxy de los criterios clínicos completos. No obstante, el marco metodológico es directamente transferible a cohortes de mayor riesgo.</w:t>
       </w:r>
     </w:p>
     <w:p>
@@ -4300,9 +4332,9 @@
           <w:rFonts w:ascii="Times New Roman" w:hAnsi="Times New Roman" w:eastAsia="Times New Roman"/>
           <w:b w:val="0"/>
           <w:i w:val="0"/>
-          <w:sz w:val="24"/>
+          <w:sz w:val="22"/>
         </w:rPr>
-        <w:t>Se presentó un pipeline reproducible de ciencia de datos que, sobre 14,8 millones de lecturas reales de CGM, estratifica objetivamente a pacientes con DM1 según los criterios de candidatura a trasplante de islotes. La variabilidad glucémica alta y el tiempo en rango insuficiente son muy frecuentes, pero el perfil de labilidad severa es minoritario (3,5%), lo que respalda una selección estricta de candidatos. La hipoglucemia inadvertida se asoció a la duración de la enfermedad y a la edad más que al CGM del momento. El aporte, desde la informática, es un pipeline reproducible y un modelo de aprendizaje automático interpretable que materializa el paradigma del factor humano de la IA (Humanware 5.0): un sistema de apoyo a la decisión que asiste —sin reemplazar— el juicio clínico.</w:t>
+        <w:t>Se presentó un pipeline reproducible de ciencia de datos que, sobre 14,8 millones de lecturas reales de CGM, estratifica objetivamente a pacientes con DM1 según los criterios de candidatura a trasplante de islotes. La variabilidad glucémica alta y el tiempo en rango insuficiente son muy frecuentes, pero el perfil de labilidad severa es minoritario (3,5%), lo que respalda una selección estricta de candidatos. La hipoglucemia inadvertida se asoció a la duración de la enfermedad y a la edad más que al CGM del momento. Más allá del hallazgo clínico, el trabajo deja un procedimiento reproducible —de la señal cruda al criterio de candidatura— que puede auditarse y reutilizarse en otras cohortes, y que se plantea como apoyo a la decisión, en sintonía con el factor humano de la inteligencia artificial (Humanware 5.0): una herramienta que asiste, sin reemplazar, el juicio del profesional.</w:t>
       </w:r>
     </w:p>
     <w:p>
@@ -4316,7 +4348,7 @@
           <w:rFonts w:ascii="Times New Roman" w:hAnsi="Times New Roman" w:eastAsia="Times New Roman"/>
           <w:b w:val="0"/>
           <w:i w:val="0"/>
-          <w:sz w:val="24"/>
+          <w:sz w:val="22"/>
         </w:rPr>
         <w:t>Como líneas futuras se plantea: (i) aplicar el pipeline a cohortes con indicación real de trasplante (p. ej., registros CIT/CITR mediante solicitud de acceso); (ii) incorporar índices de labilidad glucémica validados (LI, MAGE, ADRR) y modelos de predicción de hipoglucemia severa; (iii) integrar datos de los nuevos ensayos con tegoprubart para vincular el perfil glucémico basal con la respuesta post-trasplante; y (iv) desarrollar una herramienta de tablero interactivo para la evaluación pretrasplante.</w:t>
       </w:r>
@@ -4925,7 +4957,7 @@
     </w:pPr>
     <w:rPr>
       <w:rFonts w:ascii="Times New Roman" w:hAnsi="Times New Roman" w:eastAsia="Times New Roman"/>
-      <w:sz w:val="24"/>
+      <w:sz w:val="22"/>
     </w:rPr>
   </w:style>
   <w:style w:type="paragraph" w:styleId="Header">

</xml_diff>

<commit_message>
Diferencial técnico: índices de riesgo validados (LBGI/HBGI/ADRR) desde la señal cruda
- 01: se calculan sobre las 14,8 M de lecturas los índices de Kovatchev (transformación
  simétrica de riesgo): LBGI, HBGI y ADRR, además de las métricas de consenso.
- 03: los índices entran en la caracterización, la comparación labilidad-vs-resto y la
  matriz de correlación; se agrega figura de índices por grupo y un análisis de
  sensibilidad de la candidatura a los umbrales (Tabla 6).
- 04: nueva sección 4.5 (validación convergente + robustez), metodología ampliada y
  refs Kovatchev [15] y Ryan/Edmonton [16] (Lability Index / HYPO score).
- Validación convergente: LBGI significativamente mayor en el grupo de labilidad
  (1,4 vs 1,0; p=0,008). Paper: 11 páginas.
</commit_message>
<xml_diff>
--- a/paper/Labilidad_Glucemica_Trasplante_Islotes_DM1_UAI.docx
+++ b/paper/Labilidad_Glucemica_Trasplante_Islotes_DM1_UAI.docx
@@ -149,7 +149,7 @@
           <w:i/>
           <w:sz w:val="22"/>
         </w:rPr>
-        <w:t>El trasplante de islotes pancreáticos promete algo que hasta hace poco parecía inalcanzable: liberar de la insulina a una persona con diabetes tipo 1. El Protocolo Edmonton y, más recientemente, inmunoterapias como el tegoprubart han acercado esa promesa, pero a un costo —la inmunosupresión de por vida— que solo se justifica en los casos más graves: quienes sufren hipoglucemias severas e inadvertidas y una glucemia verdaderamente inestable. La pregunta práctica, entonces, no es solo si el trasplante cura, sino a quién conviene ofrecérselo. Este trabajo la aborda con datos reales: se procesaron 14,8 millones de lecturas de monitoreo continuo de glucosa (CGM) de 226 adultos con diabetes tipo 1 del estudio REPLACE-BG y, a partir de la señal cruda, se reconstruyeron las métricas del consenso internacional —variabilidad, tiempo en rango y tiempo en hipoglucemia— para traducir la 'labilidad' clínica en criterios objetivos y reproducibles. Aunque el mal control resultó frecuente —dos de cada tres pacientes con variabilidad alta o tiempo en rango insuficiente—, solo el 3,5 % reunió el perfil completo que justificaría evaluar un trasplante. Además, la hipoglucemia inadvertida se asoció con los años de enfermedad y la edad, y no con las métricas de glucosa del momento, lo que sugiere que la decisión no puede apoyarse únicamente en el CGM reciente. El resultado es una herramienta objetiva y reproducible para priorizar a los candidatos, que respalda con números la necesidad de una selección estricta.</w:t>
+        <w:t>El trasplante de islotes pancreáticos promete algo que hasta hace poco parecía inalcanzable: liberar de la insulina a una persona con diabetes tipo 1. El Protocolo Edmonton y, más recientemente, inmunoterapias como el tegoprubart han acercado esa promesa, pero a un costo —la inmunosupresión de por vida— que solo se justifica en los casos más graves: quienes sufren hipoglucemias severas e inadvertidas y una glucemia verdaderamente inestable. La pregunta práctica, entonces, no es solo si el trasplante cura, sino a quién conviene ofrecérselo. Este trabajo la aborda con datos reales: se procesaron 14,8 millones de lecturas de monitoreo continuo de glucosa (CGM) de 226 adultos con diabetes tipo 1 del estudio REPLACE-BG y, a partir de la señal cruda, se reconstruyeron las métricas del consenso internacional —variabilidad, tiempo en rango y tiempo en hipoglucemia— y los índices de riesgo validados de Kovatchev (LBGI, HBGI, ADRR), para traducir la 'labilidad' clínica en criterios objetivos y reproducibles. Aunque el mal control resultó frecuente —dos de cada tres pacientes con variabilidad alta o tiempo en rango insuficiente—, solo el 3,5 % reunió el perfil completo que justificaría evaluar un trasplante. Además, la hipoglucemia inadvertida se asoció con los años de enfermedad y la edad, y no con las métricas de glucosa del momento, lo que sugiere que la decisión no puede apoyarse únicamente en el CGM reciente. El resultado es una herramienta objetiva y reproducible para priorizar a los candidatos, que respalda con números la necesidad de una selección estricta.</w:t>
       </w:r>
     </w:p>
     <w:p>
@@ -203,7 +203,7 @@
           <w:i/>
           <w:sz w:val="22"/>
         </w:rPr>
-        <w:t>Pancreatic islet transplantation offers something long thought out of reach: freeing a person with type 1 diabetes from insulin. The Edmonton Protocol and, more recently, immunotherapies such as tegoprubart have brought that promise closer, but at a cost —lifelong immunosuppression— that is only justified in the most severe cases: patients with severe, impaired-awareness hypoglycemia and truly unstable glucose. The practical question is therefore not only whether transplantation cures, but for whom it is worth it. We address it with real data: we processed 14.8 million continuous glucose monitoring (CGM) readings from 226 adults with type 1 diabetes in the REPLACE-BG study and, from the raw signal, reconstructed the international-consensus metrics —variability, time in range and time in hypoglycemia— to turn clinical 'lability' into objective, reproducible criteria. Although poor control was common —two of every three patients had high variability or insufficient time in range— only 3.5% met the full profile that would justify evaluating a transplant. Moreover, impaired awareness of hypoglycemia was associated with disease duration and age rather than current glucose metrics, suggesting the decision cannot rest on recent CGM alone. The result is an objective, reproducible tool to prioritize candidates that quantitatively supports strict selection.</w:t>
+        <w:t>Pancreatic islet transplantation offers something long thought out of reach: freeing a person with type 1 diabetes from insulin. The Edmonton Protocol and, more recently, immunotherapies such as tegoprubart have brought that promise closer, but at a cost —lifelong immunosuppression— that is only justified in the most severe cases: patients with severe, impaired-awareness hypoglycemia and truly unstable glucose. The practical question is therefore not only whether transplantation cures, but for whom it is worth it. We address it with real data: we processed 14.8 million continuous glucose monitoring (CGM) readings from 226 adults with type 1 diabetes in the REPLACE-BG study and, from the raw signal, reconstructed the international-consensus metrics —variability, time in range and time in hypoglycemia— and the validated Kovatchev risk indices (LBGI, HBGI, ADRR), to turn clinical 'lability' into objective, reproducible criteria. Although poor control was common —two of every three patients had high variability or insufficient time in range— only 3.5% met the full profile that would justify evaluating a transplant. Moreover, impaired awareness of hypoglycemia was associated with disease duration and age rather than current glucose metrics, suggesting the decision cannot rest on recent CGM alone. The result is an objective, reproducible tool to prioritize candidates that quantitatively supports strict selection.</w:t>
       </w:r>
     </w:p>
     <w:p>
@@ -449,6 +449,21 @@
     </w:p>
     <w:p>
       <w:pPr>
+        <w:spacing w:after="120"/>
+        <w:jc w:val="both"/>
+      </w:pPr>
+      <w:r>
+        <w:rPr>
+          <w:rFonts w:ascii="Times New Roman" w:hAnsi="Times New Roman" w:eastAsia="Times New Roman"/>
+          <w:b w:val="0"/>
+          <w:i w:val="0"/>
+          <w:sz w:val="22"/>
+        </w:rPr>
+        <w:t>Además, a partir de la misma señal cruda se calcularon los índices de riesgo glucémico de Kovatchev [15]: el Low Blood Glucose Index (LBGI) y el High Blood Glucose Index (HBGI) —que cuantifican por separado el riesgo de hipoglucemia y de hiperglucemia mediante una transformación simétrica de la escala de glucosa— y el Average Daily Risk Range (ADRR), que resume la labilidad diaria combinando los extremos bajo y alto de cada día. Estos índices son la versión apropiada para CGM y validada del Lability Index y el HYPO score que el grupo de Edmonton (Ryan et al. [16]) empleó con glucemias capilares para evaluar la severidad de la hipoglucemia y la labilidad en la selección de candidatos a trasplante.</w:t>
+      </w:r>
+    </w:p>
+    <w:p>
+      <w:pPr>
         <w:spacing w:before="160" w:after="80"/>
         <w:jc w:val="left"/>
       </w:pPr>
@@ -474,7 +489,7 @@
           <w:i w:val="0"/>
           <w:sz w:val="22"/>
         </w:rPr>
-        <w:t>Los criterios de la indicación de trasplante se operacionalizaron combinando los cuestionarios y las métricas de CGM: (i) hipoglucemia inadvertida (IAH), definida por la pérdida de los síntomas de alarma; (ii) variabilidad glucémica alta (%CV ≥ 36%); (iii) exposición excesiva a hipoglucemia (TBR &lt;54 &gt; 1%); y (iv) tiempo en rango insuficiente (TIR &lt; 70%). El perfil de labilidad glucémica —proxy de la candidatura de Edmonton— se definió como la coexistencia de hipoglucemia inadvertida y exposición excesiva a hipoglucemia. El análisis incluyó estadística descriptiva, comparación entre subgrupos (prueba t de Welch), segmentación no supervisada de fenotipos glucémicos mediante estandarización, PCA y K-Means (k=3) con scikit-learn [13], y una regresión logística de la hipoglucemia inadvertida con statsmodels [14], en función de las métricas de CGM, la duración de la enfermedad y la edad.</w:t>
+        <w:t>Los criterios de la indicación de trasplante se operacionalizaron combinando los cuestionarios y las métricas de CGM: (i) hipoglucemia inadvertida (IAH), definida por la pérdida de los síntomas de alarma; (ii) variabilidad glucémica alta (%CV ≥ 36%); (iii) exposición excesiva a hipoglucemia (TBR &lt;54 &gt; 1%); y (iv) tiempo en rango insuficiente (TIR &lt; 70%). El perfil de labilidad glucémica —proxy de la candidatura de Edmonton— se definió como la coexistencia de hipoglucemia inadvertida y exposición excesiva a hipoglucemia. El análisis incluyó estadística descriptiva, comparación entre subgrupos (prueba t de Welch), segmentación no supervisada de fenotipos glucémicos mediante estandarización, PCA y K-Means (k=3) con scikit-learn [13], y una regresión logística de la hipoglucemia inadvertida con statsmodels [14], en función de las métricas de CGM, la duración de la enfermedad y la edad. Por último, se evaluó la robustez del criterio de candidatura mediante un análisis de sensibilidad que recalcula su prevalencia al variar el umbral operacional de exposición a hipoglucemia.</w:t>
       </w:r>
     </w:p>
     <w:p>
@@ -519,7 +534,7 @@
           <w:i w:val="0"/>
           <w:sz w:val="22"/>
         </w:rPr>
-        <w:t>La cohorte (N=226) tenía una edad media de 44,0 años, una duración media de la DM1 de 23,3 años y una HbA1c basal media de 7,3%, con equilibrio por sexo (Tabla 1). Pese al buen control aparente, las métricas de CGM revelaron una carga glucémica considerable: TIR medio del 63,1%, %CV medio del 37,4% y un tiempo en hipoglucemia &lt;54 mg/dL del 1,0% de media.</w:t>
+        <w:t>La cohorte (N=226) tenía una edad media de 44,0 años, una duración media de la DM1 de 23,3 años y una HbA1c basal media de 7,3%, con equilibrio por sexo (Tabla 1). Pese al buen control aparente, las métricas de CGM revelaron una carga glucémica considerable: TIR medio del 63,1%, %CV medio del 37,4% y un tiempo en hipoglucemia &lt;54 mg/dL del 1,0% de media. Los índices de riesgo (Tabla 1) situaron a la cohorte en un LBGI medio de 1,0 —riesgo de hipoglucemia bajo, coherente con una población que excluyó la hipoglucemia severa— y un HBGI medio de 7,6, dominado por la hiperglucemia.</w:t>
       </w:r>
     </w:p>
     <w:p>
@@ -1064,6 +1079,126 @@
                 <w:sz w:val="18"/>
               </w:rPr>
               <w:t>0.96 ± 0.91</w:t>
+            </w:r>
+          </w:p>
+        </w:tc>
+      </w:tr>
+      <w:tr>
+        <w:tc>
+          <w:tcPr>
+            <w:tcW w:type="dxa" w:w="4513"/>
+          </w:tcPr>
+          <w:p>
+            <w:pPr>
+              <w:jc w:val="left"/>
+            </w:pPr>
+            <w:r>
+              <w:rPr>
+                <w:rFonts w:ascii="Times New Roman" w:hAnsi="Times New Roman" w:eastAsia="Times New Roman"/>
+                <w:b w:val="0"/>
+                <w:i w:val="0"/>
+                <w:sz w:val="18"/>
+              </w:rPr>
+              <w:t>LBGI (riesgo de hipoglucemia)</w:t>
+            </w:r>
+          </w:p>
+        </w:tc>
+        <w:tc>
+          <w:tcPr>
+            <w:tcW w:type="dxa" w:w="4513"/>
+          </w:tcPr>
+          <w:p>
+            <w:pPr>
+              <w:jc w:val="center"/>
+            </w:pPr>
+            <w:r>
+              <w:rPr>
+                <w:rFonts w:ascii="Times New Roman" w:hAnsi="Times New Roman" w:eastAsia="Times New Roman"/>
+                <w:b w:val="0"/>
+                <w:i w:val="0"/>
+                <w:sz w:val="18"/>
+              </w:rPr>
+              <w:t>1.00 ± 0.58</w:t>
+            </w:r>
+          </w:p>
+        </w:tc>
+      </w:tr>
+      <w:tr>
+        <w:tc>
+          <w:tcPr>
+            <w:tcW w:type="dxa" w:w="4513"/>
+          </w:tcPr>
+          <w:p>
+            <w:pPr>
+              <w:jc w:val="left"/>
+            </w:pPr>
+            <w:r>
+              <w:rPr>
+                <w:rFonts w:ascii="Times New Roman" w:hAnsi="Times New Roman" w:eastAsia="Times New Roman"/>
+                <w:b w:val="0"/>
+                <w:i w:val="0"/>
+                <w:sz w:val="18"/>
+              </w:rPr>
+              <w:t>HBGI (riesgo de hiperglucemia)</w:t>
+            </w:r>
+          </w:p>
+        </w:tc>
+        <w:tc>
+          <w:tcPr>
+            <w:tcW w:type="dxa" w:w="4513"/>
+          </w:tcPr>
+          <w:p>
+            <w:pPr>
+              <w:jc w:val="center"/>
+            </w:pPr>
+            <w:r>
+              <w:rPr>
+                <w:rFonts w:ascii="Times New Roman" w:hAnsi="Times New Roman" w:eastAsia="Times New Roman"/>
+                <w:b w:val="0"/>
+                <w:i w:val="0"/>
+                <w:sz w:val="18"/>
+              </w:rPr>
+              <w:t>7.6 ± 3.4</w:t>
+            </w:r>
+          </w:p>
+        </w:tc>
+      </w:tr>
+      <w:tr>
+        <w:tc>
+          <w:tcPr>
+            <w:tcW w:type="dxa" w:w="4513"/>
+          </w:tcPr>
+          <w:p>
+            <w:pPr>
+              <w:jc w:val="left"/>
+            </w:pPr>
+            <w:r>
+              <w:rPr>
+                <w:rFonts w:ascii="Times New Roman" w:hAnsi="Times New Roman" w:eastAsia="Times New Roman"/>
+                <w:b w:val="0"/>
+                <w:i w:val="0"/>
+                <w:sz w:val="18"/>
+              </w:rPr>
+              <w:t>ADRR (rango de riesgo diario)</w:t>
+            </w:r>
+          </w:p>
+        </w:tc>
+        <w:tc>
+          <w:tcPr>
+            <w:tcW w:type="dxa" w:w="4513"/>
+          </w:tcPr>
+          <w:p>
+            <w:pPr>
+              <w:jc w:val="center"/>
+            </w:pPr>
+            <w:r>
+              <w:rPr>
+                <w:rFonts w:ascii="Times New Roman" w:hAnsi="Times New Roman" w:eastAsia="Times New Roman"/>
+                <w:b w:val="0"/>
+                <w:i w:val="0"/>
+                <w:sz w:val="18"/>
+              </w:rPr>
+              <w:t>42.4 ± 8.9</w:t>
             </w:r>
           </w:p>
         </w:tc>
@@ -1628,7 +1763,7 @@
           <w:i w:val="0"/>
           <w:sz w:val="22"/>
         </w:rPr>
-        <w:t>El mapa de riesgo (Figura 3) evidencia una relación positiva entre la variabilidad glucémica y la exposición a hipoglucemia: los pacientes con perfil de labilidad se concentran en el cuadrante de %CV y TBR&lt;54 elevados. La segmentación no supervisada (Figura 4, Tabla 4) identificó tres fenotipos glucémicos: uno de buen control (mayor TIR, menor variabilidad), uno hiperglucémico (glucosa media y TAR elevados con TIR bajo) y uno lábil (alta variabilidad y mayor exposición a hipoglucemia), que concentra los perfiles de candidatura. La comparación entre el subgrupo con perfil de labilidad y el resto (Tabla 3) confirma diferencias marcadas en variabilidad y tiempo en hipoglucemia.</w:t>
+        <w:t>El mapa de riesgo (Figura 3) evidencia una relación positiva entre la variabilidad glucémica y la exposición a hipoglucemia: los pacientes con perfil de labilidad se concentran en el cuadrante de %CV y TBR&lt;54 elevados. La segmentación no supervisada (Figura 4, Tabla 4) identificó tres fenotipos glucémicos: uno de buen control (mayor TIR, menor variabilidad), uno hiperglucémico (glucosa media y TAR elevados con TIR bajo) y uno lábil (alta variabilidad y mayor exposición a hipoglucemia), que concentra los perfiles de candidatura. La comparación entre el subgrupo con perfil de labilidad y el resto (Tabla 3) confirma diferencias marcadas en variabilidad y tiempo en hipoglucemia; en particular, el LBGI —índice validado de riesgo de hipoglucemia— fue significativamente mayor en el grupo de labilidad (1,4 frente a 1,0; p=0,008), lo que ancla el criterio categórico en una medida continua y validada del riesgo.</w:t>
       </w:r>
     </w:p>
     <w:p>
@@ -2100,6 +2235,240 @@
                 <w:sz w:val="18"/>
               </w:rPr>
               <w:t>0.716</w:t>
+            </w:r>
+          </w:p>
+        </w:tc>
+      </w:tr>
+      <w:tr>
+        <w:tc>
+          <w:tcPr>
+            <w:tcW w:type="dxa" w:w="2256"/>
+          </w:tcPr>
+          <w:p>
+            <w:pPr>
+              <w:jc w:val="left"/>
+            </w:pPr>
+            <w:r>
+              <w:rPr>
+                <w:rFonts w:ascii="Times New Roman" w:hAnsi="Times New Roman" w:eastAsia="Times New Roman"/>
+                <w:b w:val="0"/>
+                <w:i w:val="0"/>
+                <w:sz w:val="18"/>
+              </w:rPr>
+              <w:t>LBGI</w:t>
+            </w:r>
+          </w:p>
+        </w:tc>
+        <w:tc>
+          <w:tcPr>
+            <w:tcW w:type="dxa" w:w="2256"/>
+          </w:tcPr>
+          <w:p>
+            <w:pPr>
+              <w:jc w:val="center"/>
+            </w:pPr>
+            <w:r>
+              <w:rPr>
+                <w:rFonts w:ascii="Times New Roman" w:hAnsi="Times New Roman" w:eastAsia="Times New Roman"/>
+                <w:b w:val="0"/>
+                <w:i w:val="0"/>
+                <w:sz w:val="18"/>
+              </w:rPr>
+              <w:t>1.4</w:t>
+            </w:r>
+          </w:p>
+        </w:tc>
+        <w:tc>
+          <w:tcPr>
+            <w:tcW w:type="dxa" w:w="2256"/>
+          </w:tcPr>
+          <w:p>
+            <w:pPr>
+              <w:jc w:val="center"/>
+            </w:pPr>
+            <w:r>
+              <w:rPr>
+                <w:rFonts w:ascii="Times New Roman" w:hAnsi="Times New Roman" w:eastAsia="Times New Roman"/>
+                <w:b w:val="0"/>
+                <w:i w:val="0"/>
+                <w:sz w:val="18"/>
+              </w:rPr>
+              <w:t>1</w:t>
+            </w:r>
+          </w:p>
+        </w:tc>
+        <w:tc>
+          <w:tcPr>
+            <w:tcW w:type="dxa" w:w="2256"/>
+          </w:tcPr>
+          <w:p>
+            <w:pPr>
+              <w:jc w:val="center"/>
+            </w:pPr>
+            <w:r>
+              <w:rPr>
+                <w:rFonts w:ascii="Times New Roman" w:hAnsi="Times New Roman" w:eastAsia="Times New Roman"/>
+                <w:b w:val="0"/>
+                <w:i w:val="0"/>
+                <w:sz w:val="18"/>
+              </w:rPr>
+              <w:t>0.008</w:t>
+            </w:r>
+          </w:p>
+        </w:tc>
+      </w:tr>
+      <w:tr>
+        <w:tc>
+          <w:tcPr>
+            <w:tcW w:type="dxa" w:w="2256"/>
+          </w:tcPr>
+          <w:p>
+            <w:pPr>
+              <w:jc w:val="left"/>
+            </w:pPr>
+            <w:r>
+              <w:rPr>
+                <w:rFonts w:ascii="Times New Roman" w:hAnsi="Times New Roman" w:eastAsia="Times New Roman"/>
+                <w:b w:val="0"/>
+                <w:i w:val="0"/>
+                <w:sz w:val="18"/>
+              </w:rPr>
+              <w:t>HBGI</w:t>
+            </w:r>
+          </w:p>
+        </w:tc>
+        <w:tc>
+          <w:tcPr>
+            <w:tcW w:type="dxa" w:w="2256"/>
+          </w:tcPr>
+          <w:p>
+            <w:pPr>
+              <w:jc w:val="center"/>
+            </w:pPr>
+            <w:r>
+              <w:rPr>
+                <w:rFonts w:ascii="Times New Roman" w:hAnsi="Times New Roman" w:eastAsia="Times New Roman"/>
+                <w:b w:val="0"/>
+                <w:i w:val="0"/>
+                <w:sz w:val="18"/>
+              </w:rPr>
+              <w:t>6.9</w:t>
+            </w:r>
+          </w:p>
+        </w:tc>
+        <w:tc>
+          <w:tcPr>
+            <w:tcW w:type="dxa" w:w="2256"/>
+          </w:tcPr>
+          <w:p>
+            <w:pPr>
+              <w:jc w:val="center"/>
+            </w:pPr>
+            <w:r>
+              <w:rPr>
+                <w:rFonts w:ascii="Times New Roman" w:hAnsi="Times New Roman" w:eastAsia="Times New Roman"/>
+                <w:b w:val="0"/>
+                <w:i w:val="0"/>
+                <w:sz w:val="18"/>
+              </w:rPr>
+              <w:t>7.6</w:t>
+            </w:r>
+          </w:p>
+        </w:tc>
+        <w:tc>
+          <w:tcPr>
+            <w:tcW w:type="dxa" w:w="2256"/>
+          </w:tcPr>
+          <w:p>
+            <w:pPr>
+              <w:jc w:val="center"/>
+            </w:pPr>
+            <w:r>
+              <w:rPr>
+                <w:rFonts w:ascii="Times New Roman" w:hAnsi="Times New Roman" w:eastAsia="Times New Roman"/>
+                <w:b w:val="0"/>
+                <w:i w:val="0"/>
+                <w:sz w:val="18"/>
+              </w:rPr>
+              <w:t>0.572</w:t>
+            </w:r>
+          </w:p>
+        </w:tc>
+      </w:tr>
+      <w:tr>
+        <w:tc>
+          <w:tcPr>
+            <w:tcW w:type="dxa" w:w="2256"/>
+          </w:tcPr>
+          <w:p>
+            <w:pPr>
+              <w:jc w:val="left"/>
+            </w:pPr>
+            <w:r>
+              <w:rPr>
+                <w:rFonts w:ascii="Times New Roman" w:hAnsi="Times New Roman" w:eastAsia="Times New Roman"/>
+                <w:b w:val="0"/>
+                <w:i w:val="0"/>
+                <w:sz w:val="18"/>
+              </w:rPr>
+              <w:t>ADRR</w:t>
+            </w:r>
+          </w:p>
+        </w:tc>
+        <w:tc>
+          <w:tcPr>
+            <w:tcW w:type="dxa" w:w="2256"/>
+          </w:tcPr>
+          <w:p>
+            <w:pPr>
+              <w:jc w:val="center"/>
+            </w:pPr>
+            <w:r>
+              <w:rPr>
+                <w:rFonts w:ascii="Times New Roman" w:hAnsi="Times New Roman" w:eastAsia="Times New Roman"/>
+                <w:b w:val="0"/>
+                <w:i w:val="0"/>
+                <w:sz w:val="18"/>
+              </w:rPr>
+              <w:t>46</w:t>
+            </w:r>
+          </w:p>
+        </w:tc>
+        <w:tc>
+          <w:tcPr>
+            <w:tcW w:type="dxa" w:w="2256"/>
+          </w:tcPr>
+          <w:p>
+            <w:pPr>
+              <w:jc w:val="center"/>
+            </w:pPr>
+            <w:r>
+              <w:rPr>
+                <w:rFonts w:ascii="Times New Roman" w:hAnsi="Times New Roman" w:eastAsia="Times New Roman"/>
+                <w:b w:val="0"/>
+                <w:i w:val="0"/>
+                <w:sz w:val="18"/>
+              </w:rPr>
+              <w:t>42.2</w:t>
+            </w:r>
+          </w:p>
+        </w:tc>
+        <w:tc>
+          <w:tcPr>
+            <w:tcW w:type="dxa" w:w="2256"/>
+          </w:tcPr>
+          <w:p>
+            <w:pPr>
+              <w:jc w:val="center"/>
+            </w:pPr>
+            <w:r>
+              <w:rPr>
+                <w:rFonts w:ascii="Times New Roman" w:hAnsi="Times New Roman" w:eastAsia="Times New Roman"/>
+                <w:b w:val="0"/>
+                <w:i w:val="0"/>
+                <w:sz w:val="18"/>
+              </w:rPr>
+              <w:t>0.118</w:t>
             </w:r>
           </w:p>
         </w:tc>
@@ -4213,6 +4582,626 @@
     </w:p>
     <w:p>
       <w:pPr>
+        <w:spacing w:before="160" w:after="80"/>
+        <w:jc w:val="left"/>
+      </w:pPr>
+      <w:r>
+        <w:rPr>
+          <w:rFonts w:ascii="Times New Roman" w:hAnsi="Times New Roman" w:eastAsia="Times New Roman"/>
+          <w:b/>
+          <w:i w:val="0"/>
+          <w:sz w:val="24"/>
+        </w:rPr>
+        <w:t>4.5. Índices de riesgo validados y robustez de los criterios</w:t>
+      </w:r>
+    </w:p>
+    <w:p>
+      <w:pPr>
+        <w:spacing w:after="120"/>
+        <w:jc w:val="both"/>
+      </w:pPr>
+      <w:r>
+        <w:rPr>
+          <w:rFonts w:ascii="Times New Roman" w:hAnsi="Times New Roman" w:eastAsia="Times New Roman"/>
+          <w:b w:val="0"/>
+          <w:i w:val="0"/>
+          <w:sz w:val="22"/>
+        </w:rPr>
+        <w:t>Para anclar la definición operacional en medidas validadas, se calcularon los índices de riesgo de Kovatchev sobre la señal cruda (Figura 7). El grupo con perfil de labilidad mostró un LBGI —riesgo de hipoglucemia— significativamente mayor (p=0,008) y un ADRR más alto, mientras que su HBGI fue menor, un patrón coherente con un riesgo desplazado hacia la hipoglucemia. Cabe señalar que, calculado sobre CGM de alta frecuencia, el ADRR alcanza valores superiores a los de los cortes originales de Kovatchev —derivados de cuatro glucemias capilares por día—, por lo que estos índices se interpretan aquí de forma comparativa entre grupos y no contra umbrales absolutos.</w:t>
+      </w:r>
+    </w:p>
+    <w:p>
+      <w:pPr>
+        <w:spacing w:after="120"/>
+        <w:jc w:val="both"/>
+      </w:pPr>
+      <w:r>
+        <w:rPr>
+          <w:rFonts w:ascii="Times New Roman" w:hAnsi="Times New Roman" w:eastAsia="Times New Roman"/>
+          <w:b w:val="0"/>
+          <w:i w:val="0"/>
+          <w:sz w:val="22"/>
+        </w:rPr>
+        <w:t>La prevalencia de la candidatura depende, como toda operacionalización, de los umbrales elegidos. El análisis de sensibilidad (Tabla 6) muestra que, al mover el umbral de exposición a hipoglucemia del 0,5% al 2% de TBR&lt;54, la prevalencia del perfil pasa del 8,8% al 0,4%, correspondiendo el 3,5% al umbral de consenso (1%); exigir además variabilidad alta (%CV≥36%) casi no altera el resultado. Hacer explícitos estos umbrales —y poder recalcular el criterio— es parte del aporte: convierte una decisión tradicionalmente cualitativa en un procedimiento transparente y auditable.</w:t>
+      </w:r>
+    </w:p>
+    <w:p>
+      <w:pPr>
+        <w:spacing w:before="120"/>
+        <w:jc w:val="center"/>
+      </w:pPr>
+      <w:r>
+        <w:drawing>
+          <wp:inline xmlns:a="http://schemas.openxmlformats.org/drawingml/2006/main" xmlns:pic="http://schemas.openxmlformats.org/drawingml/2006/picture">
+            <wp:extent cx="5400000" cy="1872605"/>
+            <wp:docPr id="7" name="Picture 7"/>
+            <wp:cNvGraphicFramePr>
+              <a:graphicFrameLocks noChangeAspect="1"/>
+            </wp:cNvGraphicFramePr>
+            <a:graphic>
+              <a:graphicData uri="http://schemas.openxmlformats.org/drawingml/2006/picture">
+                <pic:pic>
+                  <pic:nvPicPr>
+                    <pic:cNvPr id="0" name="fig7_indices_riesgo.png"/>
+                    <pic:cNvPicPr/>
+                  </pic:nvPicPr>
+                  <pic:blipFill>
+                    <a:blip r:embed="rId15"/>
+                    <a:stretch>
+                      <a:fillRect/>
+                    </a:stretch>
+                  </pic:blipFill>
+                  <pic:spPr>
+                    <a:xfrm>
+                      <a:off x="0" y="0"/>
+                      <a:ext cx="5400000" cy="1872605"/>
+                    </a:xfrm>
+                    <a:prstGeom prst="rect"/>
+                  </pic:spPr>
+                </pic:pic>
+              </a:graphicData>
+            </a:graphic>
+          </wp:inline>
+        </w:drawing>
+      </w:r>
+    </w:p>
+    <w:p>
+      <w:pPr>
+        <w:spacing w:after="160"/>
+        <w:jc w:val="center"/>
+      </w:pPr>
+      <w:r>
+        <w:rPr>
+          <w:rFonts w:ascii="Times New Roman" w:hAnsi="Times New Roman" w:eastAsia="Times New Roman"/>
+          <w:b w:val="0"/>
+          <w:i w:val="0"/>
+          <w:sz w:val="22"/>
+        </w:rPr>
+        <w:t>Figura 7. Índices de riesgo glucémico de Kovatchev (LBGI, HBGI, ADRR) según el perfil de labilidad.</w:t>
+      </w:r>
+    </w:p>
+    <w:p>
+      <w:pPr>
+        <w:spacing w:before="120" w:after="40"/>
+        <w:jc w:val="center"/>
+      </w:pPr>
+      <w:r>
+        <w:rPr>
+          <w:rFonts w:ascii="Times New Roman" w:hAnsi="Times New Roman" w:eastAsia="Times New Roman"/>
+          <w:b/>
+          <w:i w:val="0"/>
+          <w:sz w:val="22"/>
+        </w:rPr>
+        <w:t>Tabla 6. Sensibilidad de la prevalencia de candidatura al umbral operacional de hipoglucemia (TBR&lt;54).</w:t>
+      </w:r>
+    </w:p>
+    <w:tbl>
+      <w:tblPr>
+        <w:tblStyle w:val="TableGrid"/>
+        <w:tblW w:type="auto" w:w="0"/>
+        <w:jc w:val="center"/>
+        <w:tblLook w:firstColumn="1" w:firstRow="1" w:lastColumn="0" w:lastRow="0" w:noHBand="0" w:noVBand="1" w:val="04A0"/>
+      </w:tblPr>
+      <w:tblGrid>
+        <w:gridCol w:w="1805"/>
+        <w:gridCol w:w="1805"/>
+        <w:gridCol w:w="1805"/>
+        <w:gridCol w:w="1805"/>
+        <w:gridCol w:w="1805"/>
+      </w:tblGrid>
+      <w:tr>
+        <w:tc>
+          <w:tcPr>
+            <w:tcW w:type="dxa" w:w="1805"/>
+          </w:tcPr>
+          <w:p>
+            <w:pPr>
+              <w:jc w:val="center"/>
+            </w:pPr>
+            <w:r>
+              <w:rPr>
+                <w:rFonts w:ascii="Times New Roman" w:hAnsi="Times New Roman" w:eastAsia="Times New Roman"/>
+                <w:b/>
+                <w:i w:val="0"/>
+                <w:sz w:val="18"/>
+              </w:rPr>
+              <w:t>Umbral TBR&lt;54 (%)</w:t>
+            </w:r>
+          </w:p>
+        </w:tc>
+        <w:tc>
+          <w:tcPr>
+            <w:tcW w:type="dxa" w:w="1805"/>
+          </w:tcPr>
+          <w:p>
+            <w:pPr>
+              <w:jc w:val="center"/>
+            </w:pPr>
+            <w:r>
+              <w:rPr>
+                <w:rFonts w:ascii="Times New Roman" w:hAnsi="Times New Roman" w:eastAsia="Times New Roman"/>
+                <w:b/>
+                <w:i w:val="0"/>
+                <w:sz w:val="18"/>
+              </w:rPr>
+              <w:t>Candidatos IAH+hipo (n)</w:t>
+            </w:r>
+          </w:p>
+        </w:tc>
+        <w:tc>
+          <w:tcPr>
+            <w:tcW w:type="dxa" w:w="1805"/>
+          </w:tcPr>
+          <w:p>
+            <w:pPr>
+              <w:jc w:val="center"/>
+            </w:pPr>
+            <w:r>
+              <w:rPr>
+                <w:rFonts w:ascii="Times New Roman" w:hAnsi="Times New Roman" w:eastAsia="Times New Roman"/>
+                <w:b/>
+                <w:i w:val="0"/>
+                <w:sz w:val="18"/>
+              </w:rPr>
+              <w:t>Prevalencia (%)</w:t>
+            </w:r>
+          </w:p>
+        </w:tc>
+        <w:tc>
+          <w:tcPr>
+            <w:tcW w:type="dxa" w:w="1805"/>
+          </w:tcPr>
+          <w:p>
+            <w:pPr>
+              <w:jc w:val="center"/>
+            </w:pPr>
+            <w:r>
+              <w:rPr>
+                <w:rFonts w:ascii="Times New Roman" w:hAnsi="Times New Roman" w:eastAsia="Times New Roman"/>
+                <w:b/>
+                <w:i w:val="0"/>
+                <w:sz w:val="18"/>
+              </w:rPr>
+              <w:t>+ exige %CV≥36 (n)</w:t>
+            </w:r>
+          </w:p>
+        </w:tc>
+        <w:tc>
+          <w:tcPr>
+            <w:tcW w:type="dxa" w:w="1805"/>
+          </w:tcPr>
+          <w:p>
+            <w:pPr>
+              <w:jc w:val="center"/>
+            </w:pPr>
+            <w:r>
+              <w:rPr>
+                <w:rFonts w:ascii="Times New Roman" w:hAnsi="Times New Roman" w:eastAsia="Times New Roman"/>
+                <w:b/>
+                <w:i w:val="0"/>
+                <w:sz w:val="18"/>
+              </w:rPr>
+              <w:t>Prevalencia estricta (%)</w:t>
+            </w:r>
+          </w:p>
+        </w:tc>
+      </w:tr>
+      <w:tr>
+        <w:tc>
+          <w:tcPr>
+            <w:tcW w:type="dxa" w:w="1805"/>
+          </w:tcPr>
+          <w:p>
+            <w:pPr>
+              <w:jc w:val="left"/>
+            </w:pPr>
+            <w:r>
+              <w:rPr>
+                <w:rFonts w:ascii="Times New Roman" w:hAnsi="Times New Roman" w:eastAsia="Times New Roman"/>
+                <w:b w:val="0"/>
+                <w:i w:val="0"/>
+                <w:sz w:val="18"/>
+              </w:rPr>
+              <w:t>0.5</w:t>
+            </w:r>
+          </w:p>
+        </w:tc>
+        <w:tc>
+          <w:tcPr>
+            <w:tcW w:type="dxa" w:w="1805"/>
+          </w:tcPr>
+          <w:p>
+            <w:pPr>
+              <w:jc w:val="center"/>
+            </w:pPr>
+            <w:r>
+              <w:rPr>
+                <w:rFonts w:ascii="Times New Roman" w:hAnsi="Times New Roman" w:eastAsia="Times New Roman"/>
+                <w:b w:val="0"/>
+                <w:i w:val="0"/>
+                <w:sz w:val="18"/>
+              </w:rPr>
+              <w:t>20</w:t>
+            </w:r>
+          </w:p>
+        </w:tc>
+        <w:tc>
+          <w:tcPr>
+            <w:tcW w:type="dxa" w:w="1805"/>
+          </w:tcPr>
+          <w:p>
+            <w:pPr>
+              <w:jc w:val="center"/>
+            </w:pPr>
+            <w:r>
+              <w:rPr>
+                <w:rFonts w:ascii="Times New Roman" w:hAnsi="Times New Roman" w:eastAsia="Times New Roman"/>
+                <w:b w:val="0"/>
+                <w:i w:val="0"/>
+                <w:sz w:val="18"/>
+              </w:rPr>
+              <w:t>8.8</w:t>
+            </w:r>
+          </w:p>
+        </w:tc>
+        <w:tc>
+          <w:tcPr>
+            <w:tcW w:type="dxa" w:w="1805"/>
+          </w:tcPr>
+          <w:p>
+            <w:pPr>
+              <w:jc w:val="center"/>
+            </w:pPr>
+            <w:r>
+              <w:rPr>
+                <w:rFonts w:ascii="Times New Roman" w:hAnsi="Times New Roman" w:eastAsia="Times New Roman"/>
+                <w:b w:val="0"/>
+                <w:i w:val="0"/>
+                <w:sz w:val="18"/>
+              </w:rPr>
+              <w:t>17</w:t>
+            </w:r>
+          </w:p>
+        </w:tc>
+        <w:tc>
+          <w:tcPr>
+            <w:tcW w:type="dxa" w:w="1805"/>
+          </w:tcPr>
+          <w:p>
+            <w:pPr>
+              <w:jc w:val="center"/>
+            </w:pPr>
+            <w:r>
+              <w:rPr>
+                <w:rFonts w:ascii="Times New Roman" w:hAnsi="Times New Roman" w:eastAsia="Times New Roman"/>
+                <w:b w:val="0"/>
+                <w:i w:val="0"/>
+                <w:sz w:val="18"/>
+              </w:rPr>
+              <w:t>7.5</w:t>
+            </w:r>
+          </w:p>
+        </w:tc>
+      </w:tr>
+      <w:tr>
+        <w:tc>
+          <w:tcPr>
+            <w:tcW w:type="dxa" w:w="1805"/>
+          </w:tcPr>
+          <w:p>
+            <w:pPr>
+              <w:jc w:val="left"/>
+            </w:pPr>
+            <w:r>
+              <w:rPr>
+                <w:rFonts w:ascii="Times New Roman" w:hAnsi="Times New Roman" w:eastAsia="Times New Roman"/>
+                <w:b w:val="0"/>
+                <w:i w:val="0"/>
+                <w:sz w:val="18"/>
+              </w:rPr>
+              <w:t>1</w:t>
+            </w:r>
+          </w:p>
+        </w:tc>
+        <w:tc>
+          <w:tcPr>
+            <w:tcW w:type="dxa" w:w="1805"/>
+          </w:tcPr>
+          <w:p>
+            <w:pPr>
+              <w:jc w:val="center"/>
+            </w:pPr>
+            <w:r>
+              <w:rPr>
+                <w:rFonts w:ascii="Times New Roman" w:hAnsi="Times New Roman" w:eastAsia="Times New Roman"/>
+                <w:b w:val="0"/>
+                <w:i w:val="0"/>
+                <w:sz w:val="18"/>
+              </w:rPr>
+              <w:t>8</w:t>
+            </w:r>
+          </w:p>
+        </w:tc>
+        <w:tc>
+          <w:tcPr>
+            <w:tcW w:type="dxa" w:w="1805"/>
+          </w:tcPr>
+          <w:p>
+            <w:pPr>
+              <w:jc w:val="center"/>
+            </w:pPr>
+            <w:r>
+              <w:rPr>
+                <w:rFonts w:ascii="Times New Roman" w:hAnsi="Times New Roman" w:eastAsia="Times New Roman"/>
+                <w:b w:val="0"/>
+                <w:i w:val="0"/>
+                <w:sz w:val="18"/>
+              </w:rPr>
+              <w:t>3.5</w:t>
+            </w:r>
+          </w:p>
+        </w:tc>
+        <w:tc>
+          <w:tcPr>
+            <w:tcW w:type="dxa" w:w="1805"/>
+          </w:tcPr>
+          <w:p>
+            <w:pPr>
+              <w:jc w:val="center"/>
+            </w:pPr>
+            <w:r>
+              <w:rPr>
+                <w:rFonts w:ascii="Times New Roman" w:hAnsi="Times New Roman" w:eastAsia="Times New Roman"/>
+                <w:b w:val="0"/>
+                <w:i w:val="0"/>
+                <w:sz w:val="18"/>
+              </w:rPr>
+              <w:t>8</w:t>
+            </w:r>
+          </w:p>
+        </w:tc>
+        <w:tc>
+          <w:tcPr>
+            <w:tcW w:type="dxa" w:w="1805"/>
+          </w:tcPr>
+          <w:p>
+            <w:pPr>
+              <w:jc w:val="center"/>
+            </w:pPr>
+            <w:r>
+              <w:rPr>
+                <w:rFonts w:ascii="Times New Roman" w:hAnsi="Times New Roman" w:eastAsia="Times New Roman"/>
+                <w:b w:val="0"/>
+                <w:i w:val="0"/>
+                <w:sz w:val="18"/>
+              </w:rPr>
+              <w:t>3.5</w:t>
+            </w:r>
+          </w:p>
+        </w:tc>
+      </w:tr>
+      <w:tr>
+        <w:tc>
+          <w:tcPr>
+            <w:tcW w:type="dxa" w:w="1805"/>
+          </w:tcPr>
+          <w:p>
+            <w:pPr>
+              <w:jc w:val="left"/>
+            </w:pPr>
+            <w:r>
+              <w:rPr>
+                <w:rFonts w:ascii="Times New Roman" w:hAnsi="Times New Roman" w:eastAsia="Times New Roman"/>
+                <w:b w:val="0"/>
+                <w:i w:val="0"/>
+                <w:sz w:val="18"/>
+              </w:rPr>
+              <w:t>1.5</w:t>
+            </w:r>
+          </w:p>
+        </w:tc>
+        <w:tc>
+          <w:tcPr>
+            <w:tcW w:type="dxa" w:w="1805"/>
+          </w:tcPr>
+          <w:p>
+            <w:pPr>
+              <w:jc w:val="center"/>
+            </w:pPr>
+            <w:r>
+              <w:rPr>
+                <w:rFonts w:ascii="Times New Roman" w:hAnsi="Times New Roman" w:eastAsia="Times New Roman"/>
+                <w:b w:val="0"/>
+                <w:i w:val="0"/>
+                <w:sz w:val="18"/>
+              </w:rPr>
+              <w:t>4</w:t>
+            </w:r>
+          </w:p>
+        </w:tc>
+        <w:tc>
+          <w:tcPr>
+            <w:tcW w:type="dxa" w:w="1805"/>
+          </w:tcPr>
+          <w:p>
+            <w:pPr>
+              <w:jc w:val="center"/>
+            </w:pPr>
+            <w:r>
+              <w:rPr>
+                <w:rFonts w:ascii="Times New Roman" w:hAnsi="Times New Roman" w:eastAsia="Times New Roman"/>
+                <w:b w:val="0"/>
+                <w:i w:val="0"/>
+                <w:sz w:val="18"/>
+              </w:rPr>
+              <w:t>1.8</w:t>
+            </w:r>
+          </w:p>
+        </w:tc>
+        <w:tc>
+          <w:tcPr>
+            <w:tcW w:type="dxa" w:w="1805"/>
+          </w:tcPr>
+          <w:p>
+            <w:pPr>
+              <w:jc w:val="center"/>
+            </w:pPr>
+            <w:r>
+              <w:rPr>
+                <w:rFonts w:ascii="Times New Roman" w:hAnsi="Times New Roman" w:eastAsia="Times New Roman"/>
+                <w:b w:val="0"/>
+                <w:i w:val="0"/>
+                <w:sz w:val="18"/>
+              </w:rPr>
+              <w:t>4</w:t>
+            </w:r>
+          </w:p>
+        </w:tc>
+        <w:tc>
+          <w:tcPr>
+            <w:tcW w:type="dxa" w:w="1805"/>
+          </w:tcPr>
+          <w:p>
+            <w:pPr>
+              <w:jc w:val="center"/>
+            </w:pPr>
+            <w:r>
+              <w:rPr>
+                <w:rFonts w:ascii="Times New Roman" w:hAnsi="Times New Roman" w:eastAsia="Times New Roman"/>
+                <w:b w:val="0"/>
+                <w:i w:val="0"/>
+                <w:sz w:val="18"/>
+              </w:rPr>
+              <w:t>1.8</w:t>
+            </w:r>
+          </w:p>
+        </w:tc>
+      </w:tr>
+      <w:tr>
+        <w:tc>
+          <w:tcPr>
+            <w:tcW w:type="dxa" w:w="1805"/>
+          </w:tcPr>
+          <w:p>
+            <w:pPr>
+              <w:jc w:val="left"/>
+            </w:pPr>
+            <w:r>
+              <w:rPr>
+                <w:rFonts w:ascii="Times New Roman" w:hAnsi="Times New Roman" w:eastAsia="Times New Roman"/>
+                <w:b w:val="0"/>
+                <w:i w:val="0"/>
+                <w:sz w:val="18"/>
+              </w:rPr>
+              <w:t>2</w:t>
+            </w:r>
+          </w:p>
+        </w:tc>
+        <w:tc>
+          <w:tcPr>
+            <w:tcW w:type="dxa" w:w="1805"/>
+          </w:tcPr>
+          <w:p>
+            <w:pPr>
+              <w:jc w:val="center"/>
+            </w:pPr>
+            <w:r>
+              <w:rPr>
+                <w:rFonts w:ascii="Times New Roman" w:hAnsi="Times New Roman" w:eastAsia="Times New Roman"/>
+                <w:b w:val="0"/>
+                <w:i w:val="0"/>
+                <w:sz w:val="18"/>
+              </w:rPr>
+              <w:t>1</w:t>
+            </w:r>
+          </w:p>
+        </w:tc>
+        <w:tc>
+          <w:tcPr>
+            <w:tcW w:type="dxa" w:w="1805"/>
+          </w:tcPr>
+          <w:p>
+            <w:pPr>
+              <w:jc w:val="center"/>
+            </w:pPr>
+            <w:r>
+              <w:rPr>
+                <w:rFonts w:ascii="Times New Roman" w:hAnsi="Times New Roman" w:eastAsia="Times New Roman"/>
+                <w:b w:val="0"/>
+                <w:i w:val="0"/>
+                <w:sz w:val="18"/>
+              </w:rPr>
+              <w:t>0.4</w:t>
+            </w:r>
+          </w:p>
+        </w:tc>
+        <w:tc>
+          <w:tcPr>
+            <w:tcW w:type="dxa" w:w="1805"/>
+          </w:tcPr>
+          <w:p>
+            <w:pPr>
+              <w:jc w:val="center"/>
+            </w:pPr>
+            <w:r>
+              <w:rPr>
+                <w:rFonts w:ascii="Times New Roman" w:hAnsi="Times New Roman" w:eastAsia="Times New Roman"/>
+                <w:b w:val="0"/>
+                <w:i w:val="0"/>
+                <w:sz w:val="18"/>
+              </w:rPr>
+              <w:t>1</w:t>
+            </w:r>
+          </w:p>
+        </w:tc>
+        <w:tc>
+          <w:tcPr>
+            <w:tcW w:type="dxa" w:w="1805"/>
+          </w:tcPr>
+          <w:p>
+            <w:pPr>
+              <w:jc w:val="center"/>
+            </w:pPr>
+            <w:r>
+              <w:rPr>
+                <w:rFonts w:ascii="Times New Roman" w:hAnsi="Times New Roman" w:eastAsia="Times New Roman"/>
+                <w:b w:val="0"/>
+                <w:i w:val="0"/>
+                <w:sz w:val="18"/>
+              </w:rPr>
+              <w:t>0.4</w:t>
+            </w:r>
+          </w:p>
+        </w:tc>
+      </w:tr>
+    </w:tbl>
+    <w:p>
+      <w:pPr>
+        <w:spacing w:after="80"/>
+      </w:pPr>
+    </w:p>
+    <w:p>
+      <w:pPr>
         <w:spacing w:before="240" w:after="120"/>
         <w:jc w:val="left"/>
       </w:pPr>
@@ -4334,7 +5323,7 @@
           <w:i w:val="0"/>
           <w:sz w:val="22"/>
         </w:rPr>
-        <w:t>Se presentó un pipeline reproducible de ciencia de datos que, sobre 14,8 millones de lecturas reales de CGM, estratifica objetivamente a pacientes con DM1 según los criterios de candidatura a trasplante de islotes. La variabilidad glucémica alta y el tiempo en rango insuficiente son muy frecuentes, pero el perfil de labilidad severa es minoritario (3,5%), lo que respalda una selección estricta de candidatos. La hipoglucemia inadvertida se asoció a la duración de la enfermedad y a la edad más que al CGM del momento. Más allá del hallazgo clínico, el trabajo deja un procedimiento reproducible —de la señal cruda al criterio de candidatura— que puede auditarse y reutilizarse en otras cohortes, y que se plantea como apoyo a la decisión, en sintonía con el factor humano de la inteligencia artificial (Humanware 5.0): una herramienta que asiste, sin reemplazar, el juicio del profesional.</w:t>
+        <w:t>Se presentó un pipeline reproducible de ciencia de datos que, sobre 14,8 millones de lecturas reales de CGM, estratifica objetivamente a pacientes con DM1 según los criterios de candidatura a trasplante de islotes. La variabilidad glucémica alta y el tiempo en rango insuficiente son muy frecuentes, pero el perfil de labilidad severa es minoritario (3,5%), lo que respalda una selección estricta de candidatos. La hipoglucemia inadvertida se asoció a la duración de la enfermedad y a la edad más que al CGM del momento. Más allá del hallazgo clínico, el trabajo deja un procedimiento reproducible —de la señal cruda a los índices de riesgo validados y al criterio de candidatura— que puede auditarse y reutilizarse en otras cohortes, y que se plantea como apoyo a la decisión, en sintonía con el factor humano de la inteligencia artificial (Humanware 5.0): una herramienta que asiste, sin reemplazar, el juicio del profesional.</w:t>
       </w:r>
     </w:p>
     <w:p>
@@ -4576,6 +5565,36 @@
           <w:sz w:val="20"/>
         </w:rPr>
         <w:t>[14] S. Seabold y J. Perktold, "Statsmodels: Econometric and statistical modeling with Python", en Proc. 9th Python in Science Conf., 2010.</w:t>
+      </w:r>
+    </w:p>
+    <w:p>
+      <w:pPr>
+        <w:spacing w:after="60"/>
+        <w:jc w:val="both"/>
+      </w:pPr>
+      <w:r>
+        <w:rPr>
+          <w:rFonts w:ascii="Times New Roman" w:hAnsi="Times New Roman" w:eastAsia="Times New Roman"/>
+          <w:b w:val="0"/>
+          <w:i w:val="0"/>
+          <w:sz w:val="20"/>
+        </w:rPr>
+        <w:t>[15] B. P. Kovatchev, E. Otto, D. Cox, L. Gonder-Frederick y W. Clarke, "Evaluation of a New Measure of Blood Glucose Variability in Diabetes", Diabetes Care, vol. 29, n.º 11, pp. 2433–2438, 2006.</w:t>
+      </w:r>
+    </w:p>
+    <w:p>
+      <w:pPr>
+        <w:spacing w:after="60"/>
+        <w:jc w:val="both"/>
+      </w:pPr>
+      <w:r>
+        <w:rPr>
+          <w:rFonts w:ascii="Times New Roman" w:hAnsi="Times New Roman" w:eastAsia="Times New Roman"/>
+          <w:b w:val="0"/>
+          <w:i w:val="0"/>
+          <w:sz w:val="20"/>
+        </w:rPr>
+        <w:t>[16] E. A. Ryan, T. Shandro, K. Green et al., "Assessment of the Severity of Hypoglycemia and Glycemic Lability in Type 1 Diabetic Subjects Undergoing Islet Transplantation", Diabetes, vol. 53, n.º 4, pp. 955–962, 2004.</w:t>
       </w:r>
     </w:p>
     <w:sectPr>

</xml_diff>

<commit_message>
IA a escala: modelo interpretable de alerta temprana de hipoglucemia
- 05_early_warning.py: reencuadra la señal en ~0,8 M de ventanas y predice hipoglucemia
  a 30 min. Partición POR PACIENTE (GroupShuffleSplit/GroupKFold) para evitar fuga de
  información; compara baseline (glucosa actual) vs logística vs gradient boosting;
  explicabilidad por importancia de permutación.
- Resultados: AUC-ROC 0,985 / AUC-PR 0,857 en test por paciente; GroupKFold 0,984 ± 0,001.
  El ML aporta sobre todo en precisión-recall (0,803 -> 0,857) frente a una baseline fuerte.
- 04: metodología 3.4, resultados 4.6 (Tabla 7, Figuras 8 y 9), abstract/resumen,
  conclusión y ref [17]. Paper: 12 páginas.
- README actualizado.
</commit_message>
<xml_diff>
--- a/paper/Labilidad_Glucemica_Trasplante_Islotes_DM1_UAI.docx
+++ b/paper/Labilidad_Glucemica_Trasplante_Islotes_DM1_UAI.docx
@@ -149,7 +149,7 @@
           <w:i/>
           <w:sz w:val="22"/>
         </w:rPr>
-        <w:t>El trasplante de islotes pancreáticos promete algo que hasta hace poco parecía inalcanzable: liberar de la insulina a una persona con diabetes tipo 1. El Protocolo Edmonton y, más recientemente, inmunoterapias como el tegoprubart han acercado esa promesa, pero a un costo —la inmunosupresión de por vida— que solo se justifica en los casos más graves: quienes sufren hipoglucemias severas e inadvertidas y una glucemia verdaderamente inestable. La pregunta práctica, entonces, no es solo si el trasplante cura, sino a quién conviene ofrecérselo. Este trabajo la aborda con datos reales: se procesaron 14,8 millones de lecturas de monitoreo continuo de glucosa (CGM) de 226 adultos con diabetes tipo 1 del estudio REPLACE-BG y, a partir de la señal cruda, se reconstruyeron las métricas del consenso internacional —variabilidad, tiempo en rango y tiempo en hipoglucemia— y los índices de riesgo validados de Kovatchev (LBGI, HBGI, ADRR), para traducir la 'labilidad' clínica en criterios objetivos y reproducibles. Aunque el mal control resultó frecuente —dos de cada tres pacientes con variabilidad alta o tiempo en rango insuficiente—, solo el 3,5 % reunió el perfil completo que justificaría evaluar un trasplante. Además, la hipoglucemia inadvertida se asoció con los años de enfermedad y la edad, y no con las métricas de glucosa del momento, lo que sugiere que la decisión no puede apoyarse únicamente en el CGM reciente. El resultado es una herramienta objetiva y reproducible para priorizar a los candidatos, que respalda con números la necesidad de una selección estricta.</w:t>
+        <w:t>El trasplante de islotes pancreáticos promete algo que hasta hace poco parecía inalcanzable: liberar de la insulina a una persona con diabetes tipo 1. El Protocolo Edmonton y, más recientemente, inmunoterapias como el tegoprubart han acercado esa promesa, pero a un costo —la inmunosupresión de por vida— que solo se justifica en los casos más graves: quienes sufren hipoglucemias severas e inadvertidas y una glucemia verdaderamente inestable. La pregunta práctica, entonces, no es solo si el trasplante cura, sino a quién conviene ofrecérselo. Este trabajo la aborda con datos reales: se procesaron 14,8 millones de lecturas de monitoreo continuo de glucosa (CGM) de 226 adultos con diabetes tipo 1 del estudio REPLACE-BG y, a partir de la señal cruda, se reconstruyeron las métricas del consenso internacional —variabilidad, tiempo en rango y tiempo en hipoglucemia— y los índices de riesgo validados de Kovatchev (LBGI, HBGI, ADRR), para traducir la 'labilidad' clínica en criterios objetivos y reproducibles. Aunque el mal control resultó frecuente —dos de cada tres pacientes con variabilidad alta o tiempo en rango insuficiente—, solo el 3,5 % reunió el perfil completo que justificaría evaluar un trasplante. Además, la hipoglucemia inadvertida se asoció con los años de enfermedad y la edad, y no con las métricas de glucosa del momento, lo que sugiere que la decisión no puede apoyarse únicamente en el CGM reciente. A ello se suma un modelo de alerta temprana que, entrenado sobre unas 0,8 millones de ventanas de CGM y validado por paciente, anticipa la hipoglucemia a 30 minutos con alta discriminación (AUC-ROC 0,98). El resultado es una herramienta objetiva y reproducible para priorizar a los candidatos, que respalda con números la necesidad de una selección estricta.</w:t>
       </w:r>
     </w:p>
     <w:p>
@@ -203,7 +203,7 @@
           <w:i/>
           <w:sz w:val="22"/>
         </w:rPr>
-        <w:t>Pancreatic islet transplantation offers something long thought out of reach: freeing a person with type 1 diabetes from insulin. The Edmonton Protocol and, more recently, immunotherapies such as tegoprubart have brought that promise closer, but at a cost —lifelong immunosuppression— that is only justified in the most severe cases: patients with severe, impaired-awareness hypoglycemia and truly unstable glucose. The practical question is therefore not only whether transplantation cures, but for whom it is worth it. We address it with real data: we processed 14.8 million continuous glucose monitoring (CGM) readings from 226 adults with type 1 diabetes in the REPLACE-BG study and, from the raw signal, reconstructed the international-consensus metrics —variability, time in range and time in hypoglycemia— and the validated Kovatchev risk indices (LBGI, HBGI, ADRR), to turn clinical 'lability' into objective, reproducible criteria. Although poor control was common —two of every three patients had high variability or insufficient time in range— only 3.5% met the full profile that would justify evaluating a transplant. Moreover, impaired awareness of hypoglycemia was associated with disease duration and age rather than current glucose metrics, suggesting the decision cannot rest on recent CGM alone. The result is an objective, reproducible tool to prioritize candidates that quantitatively supports strict selection.</w:t>
+        <w:t>Pancreatic islet transplantation offers something long thought out of reach: freeing a person with type 1 diabetes from insulin. The Edmonton Protocol and, more recently, immunotherapies such as tegoprubart have brought that promise closer, but at a cost —lifelong immunosuppression— that is only justified in the most severe cases: patients with severe, impaired-awareness hypoglycemia and truly unstable glucose. The practical question is therefore not only whether transplantation cures, but for whom it is worth it. We address it with real data: we processed 14.8 million continuous glucose monitoring (CGM) readings from 226 adults with type 1 diabetes in the REPLACE-BG study and, from the raw signal, reconstructed the international-consensus metrics —variability, time in range and time in hypoglycemia— and the validated Kovatchev risk indices (LBGI, HBGI, ADRR), to turn clinical 'lability' into objective, reproducible criteria. Although poor control was common —two of every three patients had high variability or insufficient time in range— only 3.5% met the full profile that would justify evaluating a transplant. Moreover, impaired awareness of hypoglycemia was associated with disease duration and age rather than current glucose metrics, suggesting the decision cannot rest on recent CGM alone. In addition, an early-warning model trained on ~0.8 million CGM windows and validated at the patient level anticipates hypoglycemia 30 minutes ahead with high discrimination (AUC-ROC 0.98). The result is an objective, reproducible tool to prioritize candidates that quantitatively supports strict selection.</w:t>
       </w:r>
     </w:p>
     <w:p>
@@ -490,6 +490,36 @@
           <w:sz w:val="22"/>
         </w:rPr>
         <w:t>Los criterios de la indicación de trasplante se operacionalizaron combinando los cuestionarios y las métricas de CGM: (i) hipoglucemia inadvertida (IAH), definida por la pérdida de los síntomas de alarma; (ii) variabilidad glucémica alta (%CV ≥ 36%); (iii) exposición excesiva a hipoglucemia (TBR &lt;54 &gt; 1%); y (iv) tiempo en rango insuficiente (TIR &lt; 70%). El perfil de labilidad glucémica —proxy de la candidatura de Edmonton— se definió como la coexistencia de hipoglucemia inadvertida y exposición excesiva a hipoglucemia. El análisis incluyó estadística descriptiva, comparación entre subgrupos (prueba t de Welch), segmentación no supervisada de fenotipos glucémicos mediante estandarización, PCA y K-Means (k=3) con scikit-learn [13], y una regresión logística de la hipoglucemia inadvertida con statsmodels [14], en función de las métricas de CGM, la duración de la enfermedad y la edad. Por último, se evaluó la robustez del criterio de candidatura mediante un análisis de sensibilidad que recalcula su prevalencia al variar el umbral operacional de exposición a hipoglucemia.</w:t>
+      </w:r>
+    </w:p>
+    <w:p>
+      <w:pPr>
+        <w:spacing w:before="160" w:after="80"/>
+        <w:jc w:val="left"/>
+      </w:pPr>
+      <w:r>
+        <w:rPr>
+          <w:rFonts w:ascii="Times New Roman" w:hAnsi="Times New Roman" w:eastAsia="Times New Roman"/>
+          <w:b/>
+          <w:i w:val="0"/>
+          <w:sz w:val="24"/>
+        </w:rPr>
+        <w:t>3.4. Alerta temprana de hipoglucemia</w:t>
+      </w:r>
+    </w:p>
+    <w:p>
+      <w:pPr>
+        <w:spacing w:after="120"/>
+        <w:jc w:val="both"/>
+      </w:pPr>
+      <w:r>
+        <w:rPr>
+          <w:rFonts w:ascii="Times New Roman" w:hAnsi="Times New Roman" w:eastAsia="Times New Roman"/>
+          <w:b w:val="0"/>
+          <w:i w:val="0"/>
+          <w:sz w:val="22"/>
+        </w:rPr>
+        <w:t>Como componente de apoyo a la decisión se planteó, además, un modelo de anticipación de la hipoglucemia —un problema reconocido de la analítica de CGM (Oviedo et al. [17])—. En lugar de tratar cada paciente como una unidad, se reencuadró la señal en ventanas deslizantes: a partir de los 60 minutos previos de CGM se predice si la glucosa caerá por debajo de 70 mg/dL en los siguientes 30 minutos. De cada ventana se extrajeron variables interpretables (glucosa actual, media, desvío, mínimo, máximo, pendiente, variación, proporción de lecturas bajas y hora del día), descartando las que cruzaban huecos del sensor, lo que produjo cerca de 0,8 millones de ejemplos etiquetados. Se compararon una línea base ingenua (solo la glucosa actual), una regresión logística y un modelo de gradient boosting (scikit-learn [13]), evaluados con partición POR PACIENTE —ningún paciente comparte ventanas entre entrenamiento y test, para evitar la fuga de información— y validación cruzada por grupos. Se reportan el área bajo la curva ROC y la de precisión-recall, más apropiada ante el desbalance de clases, y la importancia de permutación como lente de interpretabilidad.</w:t>
       </w:r>
     </w:p>
     <w:p>
@@ -5202,6 +5232,415 @@
     </w:p>
     <w:p>
       <w:pPr>
+        <w:spacing w:before="160" w:after="80"/>
+        <w:jc w:val="left"/>
+      </w:pPr>
+      <w:r>
+        <w:rPr>
+          <w:rFonts w:ascii="Times New Roman" w:hAnsi="Times New Roman" w:eastAsia="Times New Roman"/>
+          <w:b/>
+          <w:i w:val="0"/>
+          <w:sz w:val="24"/>
+        </w:rPr>
+        <w:t>4.6. Alerta temprana de hipoglucemia</w:t>
+      </w:r>
+    </w:p>
+    <w:p>
+      <w:pPr>
+        <w:spacing w:after="120"/>
+        <w:jc w:val="both"/>
+      </w:pPr>
+      <w:r>
+        <w:rPr>
+          <w:rFonts w:ascii="Times New Roman" w:hAnsi="Times New Roman" w:eastAsia="Times New Roman"/>
+          <w:b w:val="0"/>
+          <w:i w:val="0"/>
+          <w:sz w:val="22"/>
+        </w:rPr>
+        <w:t>El reencuadre en ventanas generó 795.851 ejemplos (prevalencia de hipoglucemia a 30 minutos del 5,8%). Sobre pacientes no vistos en el entrenamiento, el modelo de gradient boosting alcanzó un AUC-ROC de 0,985 y un AUC-PR de 0,857, y se mantuvo estable en validación cruzada por grupos (AUC-ROC 0,984 ± 0,001), lo que confirma que no hay fuga de información (Tabla 7, Figura 8). Es honesto señalar que la línea base ingenua —la glucosa actual— ya es un predictor fuerte (AUC-ROC 0,974), porque el nivel presente condiciona el de los próximos minutos; el aporte del aprendizaje automático se ve sobre todo en la precisión-recall (AUC-PR del 0,803 al 0,857), la métrica que gobierna las falsas alarmas en un sistema de alerta. La importancia de permutación (Figura 9) muestra que el modelo se apoya en la glucosa actual, la media reciente, la tendencia y la variabilidad de la ventana —variables clínicamente interpretables—, lo que lo vuelve utilizable como apoyo transparente y no como una caja negra.</w:t>
+      </w:r>
+    </w:p>
+    <w:p>
+      <w:pPr>
+        <w:spacing w:before="120"/>
+        <w:jc w:val="center"/>
+      </w:pPr>
+      <w:r>
+        <w:drawing>
+          <wp:inline xmlns:a="http://schemas.openxmlformats.org/drawingml/2006/main" xmlns:pic="http://schemas.openxmlformats.org/drawingml/2006/picture">
+            <wp:extent cx="5760000" cy="2294319"/>
+            <wp:docPr id="8" name="Picture 8"/>
+            <wp:cNvGraphicFramePr>
+              <a:graphicFrameLocks noChangeAspect="1"/>
+            </wp:cNvGraphicFramePr>
+            <a:graphic>
+              <a:graphicData uri="http://schemas.openxmlformats.org/drawingml/2006/picture">
+                <pic:pic>
+                  <pic:nvPicPr>
+                    <pic:cNvPr id="0" name="fig8_roc_pr.png"/>
+                    <pic:cNvPicPr/>
+                  </pic:nvPicPr>
+                  <pic:blipFill>
+                    <a:blip r:embed="rId16"/>
+                    <a:stretch>
+                      <a:fillRect/>
+                    </a:stretch>
+                  </pic:blipFill>
+                  <pic:spPr>
+                    <a:xfrm>
+                      <a:off x="0" y="0"/>
+                      <a:ext cx="5760000" cy="2294319"/>
+                    </a:xfrm>
+                    <a:prstGeom prst="rect"/>
+                  </pic:spPr>
+                </pic:pic>
+              </a:graphicData>
+            </a:graphic>
+          </wp:inline>
+        </w:drawing>
+      </w:r>
+    </w:p>
+    <w:p>
+      <w:pPr>
+        <w:spacing w:after="160"/>
+        <w:jc w:val="center"/>
+      </w:pPr>
+      <w:r>
+        <w:rPr>
+          <w:rFonts w:ascii="Times New Roman" w:hAnsi="Times New Roman" w:eastAsia="Times New Roman"/>
+          <w:b w:val="0"/>
+          <w:i w:val="0"/>
+          <w:sz w:val="22"/>
+        </w:rPr>
+        <w:t>Figura 8. Alerta temprana de hipoglucemia a 30 minutos: curvas ROC y precisión-recall en pacientes no vistos.</w:t>
+      </w:r>
+    </w:p>
+    <w:p>
+      <w:pPr>
+        <w:spacing w:before="120" w:after="40"/>
+        <w:jc w:val="center"/>
+      </w:pPr>
+      <w:r>
+        <w:rPr>
+          <w:rFonts w:ascii="Times New Roman" w:hAnsi="Times New Roman" w:eastAsia="Times New Roman"/>
+          <w:b/>
+          <w:i w:val="0"/>
+          <w:sz w:val="22"/>
+        </w:rPr>
+        <w:t>Tabla 7. Desempeño de los modelos de alerta temprana de hipoglucemia (test por paciente).</w:t>
+      </w:r>
+    </w:p>
+    <w:tbl>
+      <w:tblPr>
+        <w:tblStyle w:val="TableGrid"/>
+        <w:tblW w:type="auto" w:w="0"/>
+        <w:jc w:val="center"/>
+        <w:tblLook w:firstColumn="1" w:firstRow="1" w:lastColumn="0" w:lastRow="0" w:noHBand="0" w:noVBand="1" w:val="04A0"/>
+      </w:tblPr>
+      <w:tblGrid>
+        <w:gridCol w:w="3009"/>
+        <w:gridCol w:w="3009"/>
+        <w:gridCol w:w="3009"/>
+      </w:tblGrid>
+      <w:tr>
+        <w:tc>
+          <w:tcPr>
+            <w:tcW w:type="dxa" w:w="3009"/>
+          </w:tcPr>
+          <w:p>
+            <w:pPr>
+              <w:jc w:val="center"/>
+            </w:pPr>
+            <w:r>
+              <w:rPr>
+                <w:rFonts w:ascii="Times New Roman" w:hAnsi="Times New Roman" w:eastAsia="Times New Roman"/>
+                <w:b/>
+                <w:i w:val="0"/>
+                <w:sz w:val="18"/>
+              </w:rPr>
+              <w:t>Modelo</w:t>
+            </w:r>
+          </w:p>
+        </w:tc>
+        <w:tc>
+          <w:tcPr>
+            <w:tcW w:type="dxa" w:w="3009"/>
+          </w:tcPr>
+          <w:p>
+            <w:pPr>
+              <w:jc w:val="center"/>
+            </w:pPr>
+            <w:r>
+              <w:rPr>
+                <w:rFonts w:ascii="Times New Roman" w:hAnsi="Times New Roman" w:eastAsia="Times New Roman"/>
+                <w:b/>
+                <w:i w:val="0"/>
+                <w:sz w:val="18"/>
+              </w:rPr>
+              <w:t>AUC-ROC</w:t>
+            </w:r>
+          </w:p>
+        </w:tc>
+        <w:tc>
+          <w:tcPr>
+            <w:tcW w:type="dxa" w:w="3009"/>
+          </w:tcPr>
+          <w:p>
+            <w:pPr>
+              <w:jc w:val="center"/>
+            </w:pPr>
+            <w:r>
+              <w:rPr>
+                <w:rFonts w:ascii="Times New Roman" w:hAnsi="Times New Roman" w:eastAsia="Times New Roman"/>
+                <w:b/>
+                <w:i w:val="0"/>
+                <w:sz w:val="18"/>
+              </w:rPr>
+              <w:t>AUC-PR</w:t>
+            </w:r>
+          </w:p>
+        </w:tc>
+      </w:tr>
+      <w:tr>
+        <w:tc>
+          <w:tcPr>
+            <w:tcW w:type="dxa" w:w="3009"/>
+          </w:tcPr>
+          <w:p>
+            <w:pPr>
+              <w:jc w:val="left"/>
+            </w:pPr>
+            <w:r>
+              <w:rPr>
+                <w:rFonts w:ascii="Times New Roman" w:hAnsi="Times New Roman" w:eastAsia="Times New Roman"/>
+                <w:b w:val="0"/>
+                <w:i w:val="0"/>
+                <w:sz w:val="18"/>
+              </w:rPr>
+              <w:t>Baseline (glucosa actual)</w:t>
+            </w:r>
+          </w:p>
+        </w:tc>
+        <w:tc>
+          <w:tcPr>
+            <w:tcW w:type="dxa" w:w="3009"/>
+          </w:tcPr>
+          <w:p>
+            <w:pPr>
+              <w:jc w:val="center"/>
+            </w:pPr>
+            <w:r>
+              <w:rPr>
+                <w:rFonts w:ascii="Times New Roman" w:hAnsi="Times New Roman" w:eastAsia="Times New Roman"/>
+                <w:b w:val="0"/>
+                <w:i w:val="0"/>
+                <w:sz w:val="18"/>
+              </w:rPr>
+              <w:t>0.974</w:t>
+            </w:r>
+          </w:p>
+        </w:tc>
+        <w:tc>
+          <w:tcPr>
+            <w:tcW w:type="dxa" w:w="3009"/>
+          </w:tcPr>
+          <w:p>
+            <w:pPr>
+              <w:jc w:val="center"/>
+            </w:pPr>
+            <w:r>
+              <w:rPr>
+                <w:rFonts w:ascii="Times New Roman" w:hAnsi="Times New Roman" w:eastAsia="Times New Roman"/>
+                <w:b w:val="0"/>
+                <w:i w:val="0"/>
+                <w:sz w:val="18"/>
+              </w:rPr>
+              <w:t>0.803</w:t>
+            </w:r>
+          </w:p>
+        </w:tc>
+      </w:tr>
+      <w:tr>
+        <w:tc>
+          <w:tcPr>
+            <w:tcW w:type="dxa" w:w="3009"/>
+          </w:tcPr>
+          <w:p>
+            <w:pPr>
+              <w:jc w:val="left"/>
+            </w:pPr>
+            <w:r>
+              <w:rPr>
+                <w:rFonts w:ascii="Times New Roman" w:hAnsi="Times New Roman" w:eastAsia="Times New Roman"/>
+                <w:b w:val="0"/>
+                <w:i w:val="0"/>
+                <w:sz w:val="18"/>
+              </w:rPr>
+              <w:t>Regresión logística</w:t>
+            </w:r>
+          </w:p>
+        </w:tc>
+        <w:tc>
+          <w:tcPr>
+            <w:tcW w:type="dxa" w:w="3009"/>
+          </w:tcPr>
+          <w:p>
+            <w:pPr>
+              <w:jc w:val="center"/>
+            </w:pPr>
+            <w:r>
+              <w:rPr>
+                <w:rFonts w:ascii="Times New Roman" w:hAnsi="Times New Roman" w:eastAsia="Times New Roman"/>
+                <w:b w:val="0"/>
+                <w:i w:val="0"/>
+                <w:sz w:val="18"/>
+              </w:rPr>
+              <w:t>0.983</w:t>
+            </w:r>
+          </w:p>
+        </w:tc>
+        <w:tc>
+          <w:tcPr>
+            <w:tcW w:type="dxa" w:w="3009"/>
+          </w:tcPr>
+          <w:p>
+            <w:pPr>
+              <w:jc w:val="center"/>
+            </w:pPr>
+            <w:r>
+              <w:rPr>
+                <w:rFonts w:ascii="Times New Roman" w:hAnsi="Times New Roman" w:eastAsia="Times New Roman"/>
+                <w:b w:val="0"/>
+                <w:i w:val="0"/>
+                <w:sz w:val="18"/>
+              </w:rPr>
+              <w:t>0.81</w:t>
+            </w:r>
+          </w:p>
+        </w:tc>
+      </w:tr>
+      <w:tr>
+        <w:tc>
+          <w:tcPr>
+            <w:tcW w:type="dxa" w:w="3009"/>
+          </w:tcPr>
+          <w:p>
+            <w:pPr>
+              <w:jc w:val="left"/>
+            </w:pPr>
+            <w:r>
+              <w:rPr>
+                <w:rFonts w:ascii="Times New Roman" w:hAnsi="Times New Roman" w:eastAsia="Times New Roman"/>
+                <w:b w:val="0"/>
+                <w:i w:val="0"/>
+                <w:sz w:val="18"/>
+              </w:rPr>
+              <w:t>Gradient Boosting</w:t>
+            </w:r>
+          </w:p>
+        </w:tc>
+        <w:tc>
+          <w:tcPr>
+            <w:tcW w:type="dxa" w:w="3009"/>
+          </w:tcPr>
+          <w:p>
+            <w:pPr>
+              <w:jc w:val="center"/>
+            </w:pPr>
+            <w:r>
+              <w:rPr>
+                <w:rFonts w:ascii="Times New Roman" w:hAnsi="Times New Roman" w:eastAsia="Times New Roman"/>
+                <w:b w:val="0"/>
+                <w:i w:val="0"/>
+                <w:sz w:val="18"/>
+              </w:rPr>
+              <w:t>0.985</w:t>
+            </w:r>
+          </w:p>
+        </w:tc>
+        <w:tc>
+          <w:tcPr>
+            <w:tcW w:type="dxa" w:w="3009"/>
+          </w:tcPr>
+          <w:p>
+            <w:pPr>
+              <w:jc w:val="center"/>
+            </w:pPr>
+            <w:r>
+              <w:rPr>
+                <w:rFonts w:ascii="Times New Roman" w:hAnsi="Times New Roman" w:eastAsia="Times New Roman"/>
+                <w:b w:val="0"/>
+                <w:i w:val="0"/>
+                <w:sz w:val="18"/>
+              </w:rPr>
+              <w:t>0.857</w:t>
+            </w:r>
+          </w:p>
+        </w:tc>
+      </w:tr>
+    </w:tbl>
+    <w:p>
+      <w:pPr>
+        <w:spacing w:after="80"/>
+      </w:pPr>
+    </w:p>
+    <w:p>
+      <w:pPr>
+        <w:spacing w:before="120"/>
+        <w:jc w:val="center"/>
+      </w:pPr>
+      <w:r>
+        <w:drawing>
+          <wp:inline xmlns:a="http://schemas.openxmlformats.org/drawingml/2006/main" xmlns:pic="http://schemas.openxmlformats.org/drawingml/2006/picture">
+            <wp:extent cx="4320000" cy="2627027"/>
+            <wp:docPr id="9" name="Picture 9"/>
+            <wp:cNvGraphicFramePr>
+              <a:graphicFrameLocks noChangeAspect="1"/>
+            </wp:cNvGraphicFramePr>
+            <a:graphic>
+              <a:graphicData uri="http://schemas.openxmlformats.org/drawingml/2006/picture">
+                <pic:pic>
+                  <pic:nvPicPr>
+                    <pic:cNvPr id="0" name="fig9_importancia_ew.png"/>
+                    <pic:cNvPicPr/>
+                  </pic:nvPicPr>
+                  <pic:blipFill>
+                    <a:blip r:embed="rId17"/>
+                    <a:stretch>
+                      <a:fillRect/>
+                    </a:stretch>
+                  </pic:blipFill>
+                  <pic:spPr>
+                    <a:xfrm>
+                      <a:off x="0" y="0"/>
+                      <a:ext cx="4320000" cy="2627027"/>
+                    </a:xfrm>
+                    <a:prstGeom prst="rect"/>
+                  </pic:spPr>
+                </pic:pic>
+              </a:graphicData>
+            </a:graphic>
+          </wp:inline>
+        </w:drawing>
+      </w:r>
+    </w:p>
+    <w:p>
+      <w:pPr>
+        <w:spacing w:after="160"/>
+        <w:jc w:val="center"/>
+      </w:pPr>
+      <w:r>
+        <w:rPr>
+          <w:rFonts w:ascii="Times New Roman" w:hAnsi="Times New Roman" w:eastAsia="Times New Roman"/>
+          <w:b w:val="0"/>
+          <w:i w:val="0"/>
+          <w:sz w:val="22"/>
+        </w:rPr>
+        <w:t>Figura 9. Importancia de permutación: variables que más pesan en la alerta de hipoglucemia.</w:t>
+      </w:r>
+    </w:p>
+    <w:p>
+      <w:pPr>
         <w:spacing w:before="240" w:after="120"/>
         <w:jc w:val="left"/>
       </w:pPr>
@@ -5323,7 +5762,7 @@
           <w:i w:val="0"/>
           <w:sz w:val="22"/>
         </w:rPr>
-        <w:t>Se presentó un pipeline reproducible de ciencia de datos que, sobre 14,8 millones de lecturas reales de CGM, estratifica objetivamente a pacientes con DM1 según los criterios de candidatura a trasplante de islotes. La variabilidad glucémica alta y el tiempo en rango insuficiente son muy frecuentes, pero el perfil de labilidad severa es minoritario (3,5%), lo que respalda una selección estricta de candidatos. La hipoglucemia inadvertida se asoció a la duración de la enfermedad y a la edad más que al CGM del momento. Más allá del hallazgo clínico, el trabajo deja un procedimiento reproducible —de la señal cruda a los índices de riesgo validados y al criterio de candidatura— que puede auditarse y reutilizarse en otras cohortes, y que se plantea como apoyo a la decisión, en sintonía con el factor humano de la inteligencia artificial (Humanware 5.0): una herramienta que asiste, sin reemplazar, el juicio del profesional.</w:t>
+        <w:t>Se presentó un pipeline reproducible de ciencia de datos que, sobre 14,8 millones de lecturas reales de CGM, estratifica objetivamente a pacientes con DM1 según los criterios de candidatura a trasplante de islotes. La variabilidad glucémica alta y el tiempo en rango insuficiente son muy frecuentes, pero el perfil de labilidad severa es minoritario (3,5%), lo que respalda una selección estricta de candidatos. La hipoglucemia inadvertida se asoció a la duración de la enfermedad y a la edad más que al CGM del momento. Más allá del hallazgo clínico, el trabajo deja un procedimiento reproducible —de la señal cruda a los índices de riesgo validados y al criterio de candidatura— que puede auditarse y reutilizarse en otras cohortes, sumado a un modelo interpretable de alerta temprana que anticipa la hipoglucemia a 30 minutos (validado por paciente). Todo ello se plantea como apoyo a la decisión, en sintonía con el factor humano de la inteligencia artificial (Humanware 5.0): una herramienta que asiste, sin reemplazar, el juicio del profesional.</w:t>
       </w:r>
     </w:p>
     <w:p>
@@ -5595,6 +6034,21 @@
           <w:sz w:val="20"/>
         </w:rPr>
         <w:t>[16] E. A. Ryan, T. Shandro, K. Green et al., "Assessment of the Severity of Hypoglycemia and Glycemic Lability in Type 1 Diabetic Subjects Undergoing Islet Transplantation", Diabetes, vol. 53, n.º 4, pp. 955–962, 2004.</w:t>
+      </w:r>
+    </w:p>
+    <w:p>
+      <w:pPr>
+        <w:spacing w:after="60"/>
+        <w:jc w:val="both"/>
+      </w:pPr>
+      <w:r>
+        <w:rPr>
+          <w:rFonts w:ascii="Times New Roman" w:hAnsi="Times New Roman" w:eastAsia="Times New Roman"/>
+          <w:b w:val="0"/>
+          <w:i w:val="0"/>
+          <w:sz w:val="20"/>
+        </w:rPr>
+        <w:t>[17] S. Oviedo, J. Vehí, R. Calm y J. Armengol, "A review of personalized blood glucose prediction strategies for T1DM patients", International Journal for Numerical Methods in Biomedical Engineering, vol. 33, n.º 6, e2833, 2017.</w:t>
       </w:r>
     </w:p>
     <w:sectPr>

</xml_diff>

<commit_message>
Narrativa unificada: objetivo de dos horizontes + lista de contribuciones
- Introducción: el objetivo ahora explicita los dos horizontes sobre la misma señal
  (a quién evaluar / cuándo actuar) y anuncia el modelo de alerta temprana.
- Se agrega un párrafo de contribuciones (i-iii) con el principio unificador.
- Trabajos futuros: se corrige el ítem que listaba ADRR y predicción de hipoglucemia
  como pendientes (ya implementados); ahora apunta a hipo severa, horizontes largos y MAGE.
</commit_message>
<xml_diff>
--- a/paper/Labilidad_Glucemica_Trasplante_Islotes_DM1_UAI.docx
+++ b/paper/Labilidad_Glucemica_Trasplante_Islotes_DM1_UAI.docx
@@ -290,7 +290,7 @@
           <w:i w:val="0"/>
           <w:sz w:val="22"/>
         </w:rPr>
-        <w:t>La selección de candidatos, no obstante, se apoya con frecuencia en criterios clínicos cualitativos. El monitoreo continuo de glucosa (CGM) permite cuantificar de manera objetiva la variabilidad y la exposición a hipoglucemia. El objetivo de este trabajo es construir, con datos reales y un pipeline reproducible, una estratificación objetiva de candidatos a trasplante de islotes, cuantificando en una población de DM1 la prevalencia de los criterios de labilidad glucémica que definen la indicación.</w:t>
+        <w:t>La selección de candidatos, no obstante, se apoya con frecuencia en criterios clínicos cualitativos. El monitoreo continuo de glucosa (CGM) permite cuantificar de manera objetiva la variabilidad y la exposición a hipoglucemia. El objetivo de este trabajo es doble y se apoya en una misma señal de CGM: por un lado, construir con datos reales y un pipeline reproducible una estratificación objetiva de candidatos a trasplante —cuantificando en una población de DM1 la prevalencia de los criterios de labilidad que definen la indicación—; por otro, anticipar la hipoglucemia en el corto plazo para asistir la decisión en tiempo real. Son dos horizontes de una misma pregunta: a quién conviene evaluar y cuándo conviene actuar.</w:t>
       </w:r>
     </w:p>
     <w:p>
@@ -307,6 +307,22 @@
           <w:sz w:val="22"/>
         </w:rPr>
         <w:t>El desafío no es menor del lado de los datos. Trabajar con casi 15 millones de registros de sensor obliga a procesarlos en flujo, sin cargarlos enteros en memoria, y a reconstruir a partir de la señal cruda las variables clínicas que realmente importan; recién sobre esa base tiene sentido buscar patrones y modelar el riesgo. Ese recorrido —de la señal al criterio de candidatura— se documentó de principio a fin para que cualquier equipo pueda repetirlo y auditarlo, y se concibió como apoyo a la decisión clínica: una herramienta que ordena la evidencia, no que reemplaza el juicio del profesional.</w:t>
+      </w:r>
+    </w:p>
+    <w:p>
+      <w:pPr>
+        <w:spacing w:after="120"/>
+        <w:ind w:firstLine="283"/>
+        <w:jc w:val="both"/>
+      </w:pPr>
+      <w:r>
+        <w:rPr>
+          <w:rFonts w:ascii="Times New Roman" w:hAnsi="Times New Roman" w:eastAsia="Times New Roman"/>
+          <w:b w:val="0"/>
+          <w:i w:val="0"/>
+          <w:sz w:val="22"/>
+        </w:rPr>
+        <w:t>En concreto, el trabajo aporta: (i) un procesamiento en flujo de 14,8 millones de lecturas que reconstruye, desde la señal cruda, las métricas de consenso y los índices de riesgo validados de Kovatchev (LBGI, HBGI, ADRR); (ii) una operacionalización transparente y auditable de los criterios de candidatura de Edmonton, con análisis de sensibilidad de sus umbrales; y (iii) un modelo interpretable de alerta temprana de hipoglucemia, validado por paciente para evitar la fuga de información. Los tres componentes comparten un mismo principio: convertir una señal masiva en decisiones explicables que asisten —sin reemplazar— al profesional.</w:t>
       </w:r>
     </w:p>
     <w:p>
@@ -5778,7 +5794,7 @@
           <w:i w:val="0"/>
           <w:sz w:val="22"/>
         </w:rPr>
-        <w:t>Como líneas futuras se plantea: (i) aplicar el pipeline a cohortes con indicación real de trasplante (p. ej., registros CIT/CITR mediante solicitud de acceso); (ii) incorporar índices de labilidad glucémica validados (LI, MAGE, ADRR) y modelos de predicción de hipoglucemia severa; (iii) integrar datos de los nuevos ensayos con tegoprubart para vincular el perfil glucémico basal con la respuesta post-trasplante; y (iv) desarrollar una herramienta de tablero interactivo para la evaluación pretrasplante.</w:t>
+        <w:t>Como líneas futuras se plantea: (i) aplicar el pipeline a cohortes con indicación real de trasplante (p. ej., registros CIT/CITR mediante solicitud de acceso); (ii) extender el modelo de alerta a la hipoglucemia severa (&lt;54 mg/dL) y a horizontes más largos, e incorporar índices adicionales como el MAGE; (iii) integrar datos de los nuevos ensayos con tegoprubart para vincular el perfil glucémico basal con la respuesta post-trasplante; y (iv) desarrollar una herramienta de tablero interactivo para la evaluación pretrasplante.</w:t>
       </w:r>
     </w:p>
     <w:p>

</xml_diff>